<commit_message>
Mise à jour #1 - EINS2026
</commit_message>
<xml_diff>
--- a/T5/Nom-Prenom_rapport-individuel.docx
+++ b/T5/Nom-Prenom_rapport-individuel.docx
@@ -1,6 +1,6 @@
 
 <file path=word/document.xml><?xml version="1.0" encoding="utf-8"?>
-<w:document xmlns:wpc="http://schemas.microsoft.com/office/word/2010/wordprocessingCanvas" xmlns:cx="http://schemas.microsoft.com/office/drawing/2014/chartex" xmlns:cx1="http://schemas.microsoft.com/office/drawing/2015/9/8/chartex" xmlns:cx2="http://schemas.microsoft.com/office/drawing/2015/10/21/chartex" xmlns:cx3="http://schemas.microsoft.com/office/drawing/2016/5/9/chartex" xmlns:cx4="http://schemas.microsoft.com/office/drawing/2016/5/10/chartex" xmlns:cx5="http://schemas.microsoft.com/office/drawing/2016/5/11/chartex" xmlns:cx6="http://schemas.microsoft.com/office/drawing/2016/5/12/chartex" xmlns:cx7="http://schemas.microsoft.com/office/drawing/2016/5/13/chartex" xmlns:cx8="http://schemas.microsoft.com/office/drawing/2016/5/14/chartex" xmlns:mc="http://schemas.openxmlformats.org/markup-compatibility/2006" xmlns:aink="http://schemas.microsoft.com/office/drawing/2016/ink" xmlns:am3d="http://schemas.microsoft.com/office/drawing/2017/model3d" xmlns:o="urn:schemas-microsoft-com:office:office" xmlns:oel="http://schemas.microsoft.com/office/2019/extlst" xmlns:r="http://schemas.openxmlformats.org/officeDocument/2006/relationships" xmlns:m="http://schemas.openxmlformats.org/officeDocument/2006/math" xmlns:v="urn:schemas-microsoft-com:vml" xmlns:wp14="http://schemas.microsoft.com/office/word/2010/wordprocessingDrawing" xmlns:wp="http://schemas.openxmlformats.org/drawingml/2006/wordprocessingDrawing" xmlns:w10="urn:schemas-microsoft-com:office:word" xmlns:w="http://schemas.openxmlformats.org/wordprocessingml/2006/main" xmlns:w14="http://schemas.microsoft.com/office/word/2010/wordml" xmlns:w15="http://schemas.microsoft.com/office/word/2012/wordml" xmlns:w16cex="http://schemas.microsoft.com/office/word/2018/wordml/cex" xmlns:w16cid="http://schemas.microsoft.com/office/word/2016/wordml/cid" xmlns:w16="http://schemas.microsoft.com/office/word/2018/wordml" xmlns:w16sdtdh="http://schemas.microsoft.com/office/word/2020/wordml/sdtdatahash" xmlns:w16se="http://schemas.microsoft.com/office/word/2015/wordml/symex" xmlns:wpg="http://schemas.microsoft.com/office/word/2010/wordprocessingGroup" xmlns:wpi="http://schemas.microsoft.com/office/word/2010/wordprocessingInk" xmlns:wne="http://schemas.microsoft.com/office/word/2006/wordml" xmlns:wps="http://schemas.microsoft.com/office/word/2010/wordprocessingShape" mc:Ignorable="w14 w15 w16se w16cid w16 w16cex w16sdtdh wp14">
+<w:document xmlns:wpc="http://schemas.microsoft.com/office/word/2010/wordprocessingCanvas" xmlns:cx="http://schemas.microsoft.com/office/drawing/2014/chartex" xmlns:cx1="http://schemas.microsoft.com/office/drawing/2015/9/8/chartex" xmlns:cx2="http://schemas.microsoft.com/office/drawing/2015/10/21/chartex" xmlns:cx3="http://schemas.microsoft.com/office/drawing/2016/5/9/chartex" xmlns:cx4="http://schemas.microsoft.com/office/drawing/2016/5/10/chartex" xmlns:cx5="http://schemas.microsoft.com/office/drawing/2016/5/11/chartex" xmlns:cx6="http://schemas.microsoft.com/office/drawing/2016/5/12/chartex" xmlns:cx7="http://schemas.microsoft.com/office/drawing/2016/5/13/chartex" xmlns:cx8="http://schemas.microsoft.com/office/drawing/2016/5/14/chartex" xmlns:mc="http://schemas.openxmlformats.org/markup-compatibility/2006" xmlns:aink="http://schemas.microsoft.com/office/drawing/2016/ink" xmlns:am3d="http://schemas.microsoft.com/office/drawing/2017/model3d" xmlns:o="urn:schemas-microsoft-com:office:office" xmlns:oel="http://schemas.microsoft.com/office/2019/extlst" xmlns:r="http://schemas.openxmlformats.org/officeDocument/2006/relationships" xmlns:m="http://schemas.openxmlformats.org/officeDocument/2006/math" xmlns:v="urn:schemas-microsoft-com:vml" xmlns:wp14="http://schemas.microsoft.com/office/word/2010/wordprocessingDrawing" xmlns:wp="http://schemas.openxmlformats.org/drawingml/2006/wordprocessingDrawing" xmlns:w10="urn:schemas-microsoft-com:office:word" xmlns:w="http://schemas.openxmlformats.org/wordprocessingml/2006/main" xmlns:w14="http://schemas.microsoft.com/office/word/2010/wordml" xmlns:w15="http://schemas.microsoft.com/office/word/2012/wordml" xmlns:w16cex="http://schemas.microsoft.com/office/word/2018/wordml/cex" xmlns:w16cid="http://schemas.microsoft.com/office/word/2016/wordml/cid" xmlns:w16="http://schemas.microsoft.com/office/word/2018/wordml" xmlns:w16du="http://schemas.microsoft.com/office/word/2023/wordml/word16du" xmlns:w16sdtdh="http://schemas.microsoft.com/office/word/2020/wordml/sdtdatahash" xmlns:w16sdtfl="http://schemas.microsoft.com/office/word/2024/wordml/sdtformatlock" xmlns:w16se="http://schemas.microsoft.com/office/word/2015/wordml/symex" xmlns:wpg="http://schemas.microsoft.com/office/word/2010/wordprocessingGroup" xmlns:wpi="http://schemas.microsoft.com/office/word/2010/wordprocessingInk" xmlns:wne="http://schemas.microsoft.com/office/word/2006/wordml" xmlns:wps="http://schemas.microsoft.com/office/word/2010/wordprocessingShape" mc:Ignorable="w14 w15 w16se w16cid w16 w16cex w16sdtdh w16sdtfl w16du wp14">
   <w:body>
     <w:p>
       <w:pPr>
@@ -83,7 +83,7 @@
         <w:t>202</w:t>
       </w:r>
       <w:r>
-        <w:t>4</w:t>
+        <w:t>6</w:t>
       </w:r>
       <w:r>
         <w:rPr>
@@ -122,11 +122,9 @@
       <w:r>
         <w:t xml:space="preserve"> – </w:t>
       </w:r>
-      <w:proofErr w:type="spellStart"/>
       <w:r>
-        <w:t>SigleCours</w:t>
+        <w:t>SCI707</w:t>
       </w:r>
-      <w:proofErr w:type="spellEnd"/>
     </w:p>
     <w:p>
       <w:pPr>
@@ -144,6 +142,7 @@
       <w:r>
         <w:rPr>
           <w:rFonts w:ascii="FiraGO" w:hAnsi="FiraGO" w:cs="FiraGO"/>
+          <w:highlight w:val="yellow"/>
           <w:lang w:val="fr-CA"/>
         </w:rPr>
         <w:t xml:space="preserve">Auteur : Nom, </w:t>
@@ -152,6 +151,7 @@
       <w:r>
         <w:rPr>
           <w:rFonts w:ascii="FiraGO" w:hAnsi="FiraGO" w:cs="FiraGO"/>
+          <w:highlight w:val="yellow"/>
           <w:lang w:val="fr-CA"/>
         </w:rPr>
         <w:t>Prenom</w:t>
@@ -179,7 +179,14 @@
           <w:b/>
           <w:bCs/>
         </w:rPr>
-        <w:t>29 juin 2024</w:t>
+        <w:t>29 juin 202</w:t>
+      </w:r>
+      <w:r>
+        <w:rPr>
+          <w:b/>
+          <w:bCs/>
+        </w:rPr>
+        <w:t>6</w:t>
       </w:r>
       <w:r>
         <w:rPr>
@@ -213,320 +220,100 @@
       <w:r>
         <w:t>Introduction</w:t>
       </w:r>
-    </w:p>
-    <w:p>
-      <w:pPr>
-        <w:pStyle w:val="Corpsdetexte"/>
-      </w:pPr>
       <w:bookmarkStart w:id="1" w:name="_Toc131148706"/>
       <w:bookmarkStart w:id="2" w:name="_Toc200159782"/>
       <w:bookmarkStart w:id="3" w:name="_Toc450465743"/>
+    </w:p>
+    <w:p>
       <w:r>
-        <w:t xml:space="preserve">Le projet </w:t>
-      </w:r>
-      <w:r>
-        <w:t>consiste à</w:t>
+        <w:t>Le projet consiste à définir une méthodologie pour développer un système d’identification et</w:t>
       </w:r>
       <w:r>
         <w:t xml:space="preserve"> </w:t>
       </w:r>
       <w:r>
-        <w:rPr>
-          <w:rStyle w:val="normaltextrun"/>
-        </w:rPr>
-        <w:t>définir une méthodologie pour</w:t>
+        <w:t>d’aide à la décision permettant de détecter des changements subtils dans la trajectoire de</w:t>
       </w:r>
-      <w:r>
-        <w:t xml:space="preserve"> développer un système </w:t>
-      </w:r>
-      <w:r>
-        <w:t xml:space="preserve">d’identification et d’aide au diagnostic pouvant </w:t>
-      </w:r>
-      <w:r>
-        <w:t xml:space="preserve">soutenir les médecins dans le diagnostic </w:t>
-      </w:r>
-      <w:r>
-        <w:t xml:space="preserve">du syndrome de </w:t>
-      </w:r>
-      <w:proofErr w:type="spellStart"/>
-      <w:r>
-        <w:t>Gitelman</w:t>
-      </w:r>
-      <w:proofErr w:type="spellEnd"/>
-      <w:r>
-        <w:t xml:space="preserve">. Ce système devrait faciliter l’identification des malades ayant potentiellement un syndrome de </w:t>
-      </w:r>
-      <w:proofErr w:type="spellStart"/>
-      <w:r>
-        <w:t>Gitelman</w:t>
-      </w:r>
-      <w:proofErr w:type="spellEnd"/>
-      <w:r>
-        <w:t xml:space="preserve"> et suggérer des investigations supplémentaires (question à poser ou tests de laboratoire à prescrire) pour tenter de confirmer ou d’infirmer le diagnostic.</w:t>
-      </w:r>
-    </w:p>
-    <w:p>
-      <w:pPr>
-        <w:pStyle w:val="Corpsdetexte"/>
-      </w:pPr>
-      <w:r>
-        <w:t>Aux fins de la définition de cette méthodologie, les étapes suivantes doivent être réalisées :</w:t>
-      </w:r>
-    </w:p>
-    <w:p>
-      <w:pPr>
-        <w:pStyle w:val="m6288513454735939540msobodytext"/>
-        <w:numPr>
-          <w:ilvl w:val="0"/>
-          <w:numId w:val="69"/>
-        </w:numPr>
-        <w:jc w:val="left"/>
-        <w:rPr>
-          <w:rFonts w:ascii="FiraGO" w:eastAsiaTheme="minorHAnsi" w:hAnsi="FiraGO" w:cs="FiraGO"/>
-          <w:sz w:val="22"/>
-          <w:szCs w:val="22"/>
-          <w:lang w:val="fr-FR" w:eastAsia="en-US"/>
-        </w:rPr>
-      </w:pPr>
-      <w:r>
-        <w:rPr>
-          <w:rFonts w:ascii="FiraGO" w:eastAsiaTheme="minorHAnsi" w:hAnsi="FiraGO" w:cs="FiraGO"/>
-          <w:b/>
-          <w:bCs/>
-          <w:sz w:val="22"/>
-          <w:szCs w:val="22"/>
-          <w:lang w:val="fr-FR" w:eastAsia="en-US"/>
-        </w:rPr>
-        <w:t>Présenter le problème médical</w:t>
-      </w:r>
-      <w:r>
-        <w:rPr>
-          <w:rFonts w:ascii="FiraGO" w:eastAsiaTheme="minorHAnsi" w:hAnsi="FiraGO" w:cs="FiraGO"/>
-          <w:sz w:val="22"/>
-          <w:szCs w:val="22"/>
-          <w:lang w:val="fr-FR" w:eastAsia="en-US"/>
-        </w:rPr>
-        <w:t xml:space="preserve"> : </w:t>
-      </w:r>
-      <w:r>
-        <w:rPr>
-          <w:rFonts w:ascii="FiraGO" w:eastAsiaTheme="minorHAnsi" w:hAnsi="FiraGO" w:cs="FiraGO"/>
-          <w:sz w:val="22"/>
-          <w:szCs w:val="22"/>
-          <w:lang w:val="fr-FR" w:eastAsia="en-US"/>
-        </w:rPr>
-        <w:t>développer</w:t>
-      </w:r>
-      <w:r>
-        <w:rPr>
-          <w:rFonts w:ascii="FiraGO" w:eastAsiaTheme="minorHAnsi" w:hAnsi="FiraGO" w:cs="FiraGO"/>
-          <w:sz w:val="22"/>
-          <w:szCs w:val="22"/>
-          <w:lang w:val="fr-FR" w:eastAsia="en-US"/>
-        </w:rPr>
-        <w:t xml:space="preserve"> la question à résoudre,</w:t>
-      </w:r>
-      <w:r>
-        <w:rPr>
-          <w:rFonts w:ascii="FiraGO" w:eastAsiaTheme="minorHAnsi" w:hAnsi="FiraGO" w:cs="FiraGO"/>
-          <w:sz w:val="22"/>
-          <w:szCs w:val="22"/>
-          <w:lang w:val="fr-FR" w:eastAsia="en-US"/>
-        </w:rPr>
-        <w:t xml:space="preserve"> </w:t>
-      </w:r>
-      <w:r>
-        <w:rPr>
-          <w:rFonts w:ascii="FiraGO" w:eastAsiaTheme="minorHAnsi" w:hAnsi="FiraGO" w:cs="FiraGO"/>
-          <w:sz w:val="22"/>
-          <w:szCs w:val="22"/>
-          <w:lang w:val="fr-FR" w:eastAsia="en-US"/>
-        </w:rPr>
-        <w:t xml:space="preserve">identifier </w:t>
-      </w:r>
-      <w:r>
-        <w:rPr>
-          <w:rFonts w:ascii="FiraGO" w:eastAsiaTheme="minorHAnsi" w:hAnsi="FiraGO" w:cs="FiraGO"/>
-          <w:sz w:val="22"/>
-          <w:szCs w:val="22"/>
-          <w:lang w:val="fr-FR" w:eastAsia="en-US"/>
-        </w:rPr>
-        <w:t xml:space="preserve">les </w:t>
-      </w:r>
-      <w:r>
-        <w:rPr>
-          <w:rFonts w:ascii="FiraGO" w:eastAsiaTheme="minorHAnsi" w:hAnsi="FiraGO" w:cs="FiraGO"/>
-          <w:sz w:val="22"/>
-          <w:szCs w:val="22"/>
-          <w:lang w:val="fr-FR" w:eastAsia="en-US"/>
-        </w:rPr>
-        <w:t>type</w:t>
-      </w:r>
-      <w:r>
-        <w:rPr>
-          <w:rFonts w:ascii="FiraGO" w:eastAsiaTheme="minorHAnsi" w:hAnsi="FiraGO" w:cs="FiraGO"/>
-          <w:sz w:val="22"/>
-          <w:szCs w:val="22"/>
-          <w:lang w:val="fr-FR" w:eastAsia="en-US"/>
-        </w:rPr>
-        <w:t>s</w:t>
-      </w:r>
-      <w:r>
-        <w:rPr>
-          <w:rFonts w:ascii="FiraGO" w:eastAsiaTheme="minorHAnsi" w:hAnsi="FiraGO" w:cs="FiraGO"/>
-          <w:sz w:val="22"/>
-          <w:szCs w:val="22"/>
-          <w:lang w:val="fr-FR" w:eastAsia="en-US"/>
-        </w:rPr>
-        <w:t xml:space="preserve"> de données à recueillir et les sources de données potentielles.</w:t>
-      </w:r>
-    </w:p>
-    <w:p>
-      <w:pPr>
-        <w:pStyle w:val="Corpsdetexte"/>
-        <w:numPr>
-          <w:ilvl w:val="0"/>
-          <w:numId w:val="69"/>
-        </w:numPr>
-        <w:spacing w:beforeAutospacing="0" w:after="120" w:afterAutospacing="0"/>
-      </w:pPr>
-      <w:r>
-        <w:rPr>
-          <w:b/>
-          <w:bCs/>
-        </w:rPr>
-        <w:t>Proposer un modèle de connaissance </w:t>
-      </w:r>
-      <w:r>
-        <w:t xml:space="preserve">: </w:t>
-      </w:r>
-      <w:r>
-        <w:t>développer</w:t>
-      </w:r>
-      <w:r>
-        <w:t xml:space="preserve"> une ontologie minimale </w:t>
-      </w:r>
-      <w:r>
-        <w:t xml:space="preserve">pour formaliser la définition des entités et leurs relations (entités informationnelles, processus, etc.) afin de </w:t>
-      </w:r>
-      <w:r>
-        <w:t>supporter l</w:t>
-      </w:r>
-      <w:r>
-        <w:t>’</w:t>
-      </w:r>
-      <w:r>
-        <w:t xml:space="preserve">identification </w:t>
-      </w:r>
-      <w:r>
-        <w:t xml:space="preserve">du syndrome de </w:t>
-      </w:r>
-      <w:proofErr w:type="spellStart"/>
-      <w:r>
-        <w:t>Gitelman</w:t>
-      </w:r>
-      <w:proofErr w:type="spellEnd"/>
       <w:r>
         <w:t xml:space="preserve"> </w:t>
       </w:r>
       <w:r>
-        <w:t>à partir des données de santé</w:t>
+        <w:t>santé de personnes âgées vivant avec multimorbidité.</w:t>
       </w:r>
       <w:r>
-        <w:t>.</w:t>
+        <w:t xml:space="preserve"> </w:t>
+      </w:r>
+      <w:r>
+        <w:t>Un tel système pourrait soutenir les professionnels de la santé dans l’identification de</w:t>
+      </w:r>
+      <w:r>
+        <w:t xml:space="preserve"> </w:t>
+      </w:r>
+      <w:r>
+        <w:t>situations où une investigation plus approfondie ou une adaptation du suivi clinique pourrait</w:t>
+      </w:r>
+      <w:r>
+        <w:t xml:space="preserve"> </w:t>
+      </w:r>
+      <w:r>
+        <w:t>être pertinente, même en l’absence d’un indicateur clinique unique clairement anormal.</w:t>
+      </w:r>
+      <w:r>
+        <w:t xml:space="preserve"> </w:t>
+      </w:r>
+      <w:r>
+        <w:t>Aux fins de la définition de cette méthodologie, les étapes suivantes doivent être réalisées :</w:t>
       </w:r>
     </w:p>
     <w:p>
       <w:pPr>
-        <w:pStyle w:val="Corpsdetexte"/>
+        <w:pStyle w:val="Paragraphedeliste"/>
         <w:numPr>
           <w:ilvl w:val="0"/>
-          <w:numId w:val="69"/>
+          <w:numId w:val="71"/>
         </w:numPr>
-        <w:spacing w:beforeAutospacing="0" w:after="120" w:afterAutospacing="0"/>
       </w:pPr>
       <w:r>
-        <w:rPr>
-          <w:b/>
-          <w:bCs/>
-        </w:rPr>
-        <w:t>Proposer une méthode d’analyse</w:t>
-      </w:r>
-      <w:r>
-        <w:t xml:space="preserve"> : définir la méthodologie d’analyse pour identifier les personnes potentiellement atteintes du syndrome de </w:t>
-      </w:r>
-      <w:proofErr w:type="spellStart"/>
-      <w:r>
-        <w:t>Gitelman</w:t>
-      </w:r>
-      <w:proofErr w:type="spellEnd"/>
-      <w:r>
-        <w:t xml:space="preserve"> et proposer des investigations supplémentaires au besoin :</w:t>
+        <w:t>Présenter le problème de santé</w:t>
       </w:r>
     </w:p>
     <w:p>
       <w:pPr>
-        <w:pStyle w:val="Corpsdetexte"/>
+        <w:pStyle w:val="Paragraphedeliste"/>
         <w:numPr>
-          <w:ilvl w:val="1"/>
-          <w:numId w:val="69"/>
+          <w:ilvl w:val="0"/>
+          <w:numId w:val="71"/>
         </w:numPr>
-        <w:spacing w:beforeAutospacing="0" w:after="120" w:afterAutospacing="0"/>
       </w:pPr>
       <w:r>
-        <w:t>Identifier les biais potentiels lors de la collecte de données dans le contexte d’analyse de données.</w:t>
+        <w:t>Proposer un modèle de connaissance</w:t>
       </w:r>
     </w:p>
     <w:p>
       <w:pPr>
-        <w:pStyle w:val="Corpsdetexte"/>
+        <w:pStyle w:val="Paragraphedeliste"/>
         <w:numPr>
-          <w:ilvl w:val="1"/>
-          <w:numId w:val="69"/>
+          <w:ilvl w:val="0"/>
+          <w:numId w:val="71"/>
         </w:numPr>
-        <w:spacing w:beforeAutospacing="0" w:after="120" w:afterAutospacing="0"/>
       </w:pPr>
       <w:r>
-        <w:t>Identifier les facteurs autres que les facteurs statistiques à prendre en compte pour récupérer ces informations.</w:t>
+        <w:t>Proposer une méthode d’analyse</w:t>
       </w:r>
     </w:p>
     <w:p>
       <w:pPr>
-        <w:pStyle w:val="Corpsdetexte"/>
+        <w:pStyle w:val="Paragraphedeliste"/>
         <w:numPr>
           <w:ilvl w:val="0"/>
-          <w:numId w:val="69"/>
+          <w:numId w:val="71"/>
         </w:numPr>
-        <w:spacing w:beforeAutospacing="0" w:after="120" w:afterAutospacing="0"/>
       </w:pPr>
       <w:r>
-        <w:rPr>
-          <w:b/>
-          <w:bCs/>
-        </w:rPr>
         <w:t>Proposer un protocole éthique minimal</w:t>
-      </w:r>
-      <w:r>
-        <w:t> : définir un protocole d’étude qui</w:t>
-      </w:r>
-      <w:r>
-        <w:t xml:space="preserve"> respecte les règles éthiques et légales</w:t>
-      </w:r>
-      <w:r>
-        <w:t xml:space="preserve"> relatives au consentement et à la transparence afin de pouvoir tester l’approche proposée</w:t>
-      </w:r>
-      <w:r>
-        <w:t>.</w:t>
-      </w:r>
-      <w:r>
-        <w:t xml:space="preserve"> Le protocole doit inclure les aspects nécessaires visant à s’assurer de l’acceptabilité sociale du système.</w:t>
       </w:r>
     </w:p>
     <w:p>
-      <w:pPr>
-        <w:spacing w:before="0" w:beforeAutospacing="0" w:after="200" w:afterAutospacing="0" w:line="276" w:lineRule="auto"/>
-        <w:jc w:val="left"/>
-      </w:pPr>
       <w:r>
         <w:br w:type="page"/>
       </w:r>
@@ -704,7 +491,7 @@
 </file>
 
 <file path=word/endnotes.xml><?xml version="1.0" encoding="utf-8"?>
-<w:endnotes xmlns:wpc="http://schemas.microsoft.com/office/word/2010/wordprocessingCanvas" xmlns:cx="http://schemas.microsoft.com/office/drawing/2014/chartex" xmlns:cx1="http://schemas.microsoft.com/office/drawing/2015/9/8/chartex" xmlns:cx2="http://schemas.microsoft.com/office/drawing/2015/10/21/chartex" xmlns:cx3="http://schemas.microsoft.com/office/drawing/2016/5/9/chartex" xmlns:cx4="http://schemas.microsoft.com/office/drawing/2016/5/10/chartex" xmlns:cx5="http://schemas.microsoft.com/office/drawing/2016/5/11/chartex" xmlns:cx6="http://schemas.microsoft.com/office/drawing/2016/5/12/chartex" xmlns:cx7="http://schemas.microsoft.com/office/drawing/2016/5/13/chartex" xmlns:cx8="http://schemas.microsoft.com/office/drawing/2016/5/14/chartex" xmlns:mc="http://schemas.openxmlformats.org/markup-compatibility/2006" xmlns:aink="http://schemas.microsoft.com/office/drawing/2016/ink" xmlns:am3d="http://schemas.microsoft.com/office/drawing/2017/model3d" xmlns:o="urn:schemas-microsoft-com:office:office" xmlns:oel="http://schemas.microsoft.com/office/2019/extlst" xmlns:r="http://schemas.openxmlformats.org/officeDocument/2006/relationships" xmlns:m="http://schemas.openxmlformats.org/officeDocument/2006/math" xmlns:v="urn:schemas-microsoft-com:vml" xmlns:wp14="http://schemas.microsoft.com/office/word/2010/wordprocessingDrawing" xmlns:wp="http://schemas.openxmlformats.org/drawingml/2006/wordprocessingDrawing" xmlns:w10="urn:schemas-microsoft-com:office:word" xmlns:w="http://schemas.openxmlformats.org/wordprocessingml/2006/main" xmlns:w14="http://schemas.microsoft.com/office/word/2010/wordml" xmlns:w15="http://schemas.microsoft.com/office/word/2012/wordml" xmlns:w16cex="http://schemas.microsoft.com/office/word/2018/wordml/cex" xmlns:w16cid="http://schemas.microsoft.com/office/word/2016/wordml/cid" xmlns:w16="http://schemas.microsoft.com/office/word/2018/wordml" xmlns:w16sdtdh="http://schemas.microsoft.com/office/word/2020/wordml/sdtdatahash" xmlns:w16se="http://schemas.microsoft.com/office/word/2015/wordml/symex" xmlns:wpg="http://schemas.microsoft.com/office/word/2010/wordprocessingGroup" xmlns:wpi="http://schemas.microsoft.com/office/word/2010/wordprocessingInk" xmlns:wne="http://schemas.microsoft.com/office/word/2006/wordml" xmlns:wps="http://schemas.microsoft.com/office/word/2010/wordprocessingShape" mc:Ignorable="w14 w15 w16se w16cid w16 w16cex w16sdtdh wp14">
+<w:endnotes xmlns:wpc="http://schemas.microsoft.com/office/word/2010/wordprocessingCanvas" xmlns:cx="http://schemas.microsoft.com/office/drawing/2014/chartex" xmlns:cx1="http://schemas.microsoft.com/office/drawing/2015/9/8/chartex" xmlns:cx2="http://schemas.microsoft.com/office/drawing/2015/10/21/chartex" xmlns:cx3="http://schemas.microsoft.com/office/drawing/2016/5/9/chartex" xmlns:cx4="http://schemas.microsoft.com/office/drawing/2016/5/10/chartex" xmlns:cx5="http://schemas.microsoft.com/office/drawing/2016/5/11/chartex" xmlns:cx6="http://schemas.microsoft.com/office/drawing/2016/5/12/chartex" xmlns:cx7="http://schemas.microsoft.com/office/drawing/2016/5/13/chartex" xmlns:cx8="http://schemas.microsoft.com/office/drawing/2016/5/14/chartex" xmlns:mc="http://schemas.openxmlformats.org/markup-compatibility/2006" xmlns:aink="http://schemas.microsoft.com/office/drawing/2016/ink" xmlns:am3d="http://schemas.microsoft.com/office/drawing/2017/model3d" xmlns:o="urn:schemas-microsoft-com:office:office" xmlns:oel="http://schemas.microsoft.com/office/2019/extlst" xmlns:r="http://schemas.openxmlformats.org/officeDocument/2006/relationships" xmlns:m="http://schemas.openxmlformats.org/officeDocument/2006/math" xmlns:v="urn:schemas-microsoft-com:vml" xmlns:wp14="http://schemas.microsoft.com/office/word/2010/wordprocessingDrawing" xmlns:wp="http://schemas.openxmlformats.org/drawingml/2006/wordprocessingDrawing" xmlns:w10="urn:schemas-microsoft-com:office:word" xmlns:w="http://schemas.openxmlformats.org/wordprocessingml/2006/main" xmlns:w14="http://schemas.microsoft.com/office/word/2010/wordml" xmlns:w15="http://schemas.microsoft.com/office/word/2012/wordml" xmlns:w16cex="http://schemas.microsoft.com/office/word/2018/wordml/cex" xmlns:w16cid="http://schemas.microsoft.com/office/word/2016/wordml/cid" xmlns:w16="http://schemas.microsoft.com/office/word/2018/wordml" xmlns:w16du="http://schemas.microsoft.com/office/word/2023/wordml/word16du" xmlns:w16sdtdh="http://schemas.microsoft.com/office/word/2020/wordml/sdtdatahash" xmlns:w16sdtfl="http://schemas.microsoft.com/office/word/2024/wordml/sdtformatlock" xmlns:w16se="http://schemas.microsoft.com/office/word/2015/wordml/symex" xmlns:wpg="http://schemas.microsoft.com/office/word/2010/wordprocessingGroup" xmlns:wpi="http://schemas.microsoft.com/office/word/2010/wordprocessingInk" xmlns:wne="http://schemas.microsoft.com/office/word/2006/wordml" xmlns:wps="http://schemas.microsoft.com/office/word/2010/wordprocessingShape" mc:Ignorable="w14 w15 w16se w16cid w16 w16cex w16sdtdh w16sdtfl w16du wp14">
   <w:endnote w:type="separator" w:id="-1">
     <w:p>
       <w:r>
@@ -726,7 +513,7 @@
 </file>
 
 <file path=word/footer1.xml><?xml version="1.0" encoding="utf-8"?>
-<w:ftr xmlns:wpc="http://schemas.microsoft.com/office/word/2010/wordprocessingCanvas" xmlns:cx="http://schemas.microsoft.com/office/drawing/2014/chartex" xmlns:cx1="http://schemas.microsoft.com/office/drawing/2015/9/8/chartex" xmlns:cx2="http://schemas.microsoft.com/office/drawing/2015/10/21/chartex" xmlns:cx3="http://schemas.microsoft.com/office/drawing/2016/5/9/chartex" xmlns:cx4="http://schemas.microsoft.com/office/drawing/2016/5/10/chartex" xmlns:cx5="http://schemas.microsoft.com/office/drawing/2016/5/11/chartex" xmlns:cx6="http://schemas.microsoft.com/office/drawing/2016/5/12/chartex" xmlns:cx7="http://schemas.microsoft.com/office/drawing/2016/5/13/chartex" xmlns:cx8="http://schemas.microsoft.com/office/drawing/2016/5/14/chartex" xmlns:mc="http://schemas.openxmlformats.org/markup-compatibility/2006" xmlns:aink="http://schemas.microsoft.com/office/drawing/2016/ink" xmlns:am3d="http://schemas.microsoft.com/office/drawing/2017/model3d" xmlns:o="urn:schemas-microsoft-com:office:office" xmlns:oel="http://schemas.microsoft.com/office/2019/extlst" xmlns:r="http://schemas.openxmlformats.org/officeDocument/2006/relationships" xmlns:m="http://schemas.openxmlformats.org/officeDocument/2006/math" xmlns:v="urn:schemas-microsoft-com:vml" xmlns:wp14="http://schemas.microsoft.com/office/word/2010/wordprocessingDrawing" xmlns:wp="http://schemas.openxmlformats.org/drawingml/2006/wordprocessingDrawing" xmlns:w10="urn:schemas-microsoft-com:office:word" xmlns:w="http://schemas.openxmlformats.org/wordprocessingml/2006/main" xmlns:w14="http://schemas.microsoft.com/office/word/2010/wordml" xmlns:w15="http://schemas.microsoft.com/office/word/2012/wordml" xmlns:w16cex="http://schemas.microsoft.com/office/word/2018/wordml/cex" xmlns:w16cid="http://schemas.microsoft.com/office/word/2016/wordml/cid" xmlns:w16="http://schemas.microsoft.com/office/word/2018/wordml" xmlns:w16sdtdh="http://schemas.microsoft.com/office/word/2020/wordml/sdtdatahash" xmlns:w16se="http://schemas.microsoft.com/office/word/2015/wordml/symex" xmlns:wpg="http://schemas.microsoft.com/office/word/2010/wordprocessingGroup" xmlns:wpi="http://schemas.microsoft.com/office/word/2010/wordprocessingInk" xmlns:wne="http://schemas.microsoft.com/office/word/2006/wordml" xmlns:wps="http://schemas.microsoft.com/office/word/2010/wordprocessingShape" mc:Ignorable="w14 w15 w16se w16cid w16 w16cex w16sdtdh wp14">
+<w:ftr xmlns:wpc="http://schemas.microsoft.com/office/word/2010/wordprocessingCanvas" xmlns:cx="http://schemas.microsoft.com/office/drawing/2014/chartex" xmlns:cx1="http://schemas.microsoft.com/office/drawing/2015/9/8/chartex" xmlns:cx2="http://schemas.microsoft.com/office/drawing/2015/10/21/chartex" xmlns:cx3="http://schemas.microsoft.com/office/drawing/2016/5/9/chartex" xmlns:cx4="http://schemas.microsoft.com/office/drawing/2016/5/10/chartex" xmlns:cx5="http://schemas.microsoft.com/office/drawing/2016/5/11/chartex" xmlns:cx6="http://schemas.microsoft.com/office/drawing/2016/5/12/chartex" xmlns:cx7="http://schemas.microsoft.com/office/drawing/2016/5/13/chartex" xmlns:cx8="http://schemas.microsoft.com/office/drawing/2016/5/14/chartex" xmlns:mc="http://schemas.openxmlformats.org/markup-compatibility/2006" xmlns:aink="http://schemas.microsoft.com/office/drawing/2016/ink" xmlns:am3d="http://schemas.microsoft.com/office/drawing/2017/model3d" xmlns:o="urn:schemas-microsoft-com:office:office" xmlns:oel="http://schemas.microsoft.com/office/2019/extlst" xmlns:r="http://schemas.openxmlformats.org/officeDocument/2006/relationships" xmlns:m="http://schemas.openxmlformats.org/officeDocument/2006/math" xmlns:v="urn:schemas-microsoft-com:vml" xmlns:wp14="http://schemas.microsoft.com/office/word/2010/wordprocessingDrawing" xmlns:wp="http://schemas.openxmlformats.org/drawingml/2006/wordprocessingDrawing" xmlns:w10="urn:schemas-microsoft-com:office:word" xmlns:w="http://schemas.openxmlformats.org/wordprocessingml/2006/main" xmlns:w14="http://schemas.microsoft.com/office/word/2010/wordml" xmlns:w15="http://schemas.microsoft.com/office/word/2012/wordml" xmlns:w16cex="http://schemas.microsoft.com/office/word/2018/wordml/cex" xmlns:w16cid="http://schemas.microsoft.com/office/word/2016/wordml/cid" xmlns:w16="http://schemas.microsoft.com/office/word/2018/wordml" xmlns:w16du="http://schemas.microsoft.com/office/word/2023/wordml/word16du" xmlns:w16sdtdh="http://schemas.microsoft.com/office/word/2020/wordml/sdtdatahash" xmlns:w16sdtfl="http://schemas.microsoft.com/office/word/2024/wordml/sdtformatlock" xmlns:w16se="http://schemas.microsoft.com/office/word/2015/wordml/symex" xmlns:wpg="http://schemas.microsoft.com/office/word/2010/wordprocessingGroup" xmlns:wpi="http://schemas.microsoft.com/office/word/2010/wordprocessingInk" xmlns:wne="http://schemas.microsoft.com/office/word/2006/wordml" xmlns:wps="http://schemas.microsoft.com/office/word/2010/wordprocessingShape" mc:Ignorable="w14 w15 w16se w16cid w16 w16cex w16sdtdh w16sdtfl w16du wp14">
   <w:sdt>
     <w:sdtPr>
       <w:id w:val="573397091"/>
@@ -762,7 +549,7 @@
 </file>
 
 <file path=word/footnotes.xml><?xml version="1.0" encoding="utf-8"?>
-<w:footnotes xmlns:wpc="http://schemas.microsoft.com/office/word/2010/wordprocessingCanvas" xmlns:cx="http://schemas.microsoft.com/office/drawing/2014/chartex" xmlns:cx1="http://schemas.microsoft.com/office/drawing/2015/9/8/chartex" xmlns:cx2="http://schemas.microsoft.com/office/drawing/2015/10/21/chartex" xmlns:cx3="http://schemas.microsoft.com/office/drawing/2016/5/9/chartex" xmlns:cx4="http://schemas.microsoft.com/office/drawing/2016/5/10/chartex" xmlns:cx5="http://schemas.microsoft.com/office/drawing/2016/5/11/chartex" xmlns:cx6="http://schemas.microsoft.com/office/drawing/2016/5/12/chartex" xmlns:cx7="http://schemas.microsoft.com/office/drawing/2016/5/13/chartex" xmlns:cx8="http://schemas.microsoft.com/office/drawing/2016/5/14/chartex" xmlns:mc="http://schemas.openxmlformats.org/markup-compatibility/2006" xmlns:aink="http://schemas.microsoft.com/office/drawing/2016/ink" xmlns:am3d="http://schemas.microsoft.com/office/drawing/2017/model3d" xmlns:o="urn:schemas-microsoft-com:office:office" xmlns:oel="http://schemas.microsoft.com/office/2019/extlst" xmlns:r="http://schemas.openxmlformats.org/officeDocument/2006/relationships" xmlns:m="http://schemas.openxmlformats.org/officeDocument/2006/math" xmlns:v="urn:schemas-microsoft-com:vml" xmlns:wp14="http://schemas.microsoft.com/office/word/2010/wordprocessingDrawing" xmlns:wp="http://schemas.openxmlformats.org/drawingml/2006/wordprocessingDrawing" xmlns:w10="urn:schemas-microsoft-com:office:word" xmlns:w="http://schemas.openxmlformats.org/wordprocessingml/2006/main" xmlns:w14="http://schemas.microsoft.com/office/word/2010/wordml" xmlns:w15="http://schemas.microsoft.com/office/word/2012/wordml" xmlns:w16cex="http://schemas.microsoft.com/office/word/2018/wordml/cex" xmlns:w16cid="http://schemas.microsoft.com/office/word/2016/wordml/cid" xmlns:w16="http://schemas.microsoft.com/office/word/2018/wordml" xmlns:w16sdtdh="http://schemas.microsoft.com/office/word/2020/wordml/sdtdatahash" xmlns:w16se="http://schemas.microsoft.com/office/word/2015/wordml/symex" xmlns:wpg="http://schemas.microsoft.com/office/word/2010/wordprocessingGroup" xmlns:wpi="http://schemas.microsoft.com/office/word/2010/wordprocessingInk" xmlns:wne="http://schemas.microsoft.com/office/word/2006/wordml" xmlns:wps="http://schemas.microsoft.com/office/word/2010/wordprocessingShape" mc:Ignorable="w14 w15 w16se w16cid w16 w16cex w16sdtdh wp14">
+<w:footnotes xmlns:wpc="http://schemas.microsoft.com/office/word/2010/wordprocessingCanvas" xmlns:cx="http://schemas.microsoft.com/office/drawing/2014/chartex" xmlns:cx1="http://schemas.microsoft.com/office/drawing/2015/9/8/chartex" xmlns:cx2="http://schemas.microsoft.com/office/drawing/2015/10/21/chartex" xmlns:cx3="http://schemas.microsoft.com/office/drawing/2016/5/9/chartex" xmlns:cx4="http://schemas.microsoft.com/office/drawing/2016/5/10/chartex" xmlns:cx5="http://schemas.microsoft.com/office/drawing/2016/5/11/chartex" xmlns:cx6="http://schemas.microsoft.com/office/drawing/2016/5/12/chartex" xmlns:cx7="http://schemas.microsoft.com/office/drawing/2016/5/13/chartex" xmlns:cx8="http://schemas.microsoft.com/office/drawing/2016/5/14/chartex" xmlns:mc="http://schemas.openxmlformats.org/markup-compatibility/2006" xmlns:aink="http://schemas.microsoft.com/office/drawing/2016/ink" xmlns:am3d="http://schemas.microsoft.com/office/drawing/2017/model3d" xmlns:o="urn:schemas-microsoft-com:office:office" xmlns:oel="http://schemas.microsoft.com/office/2019/extlst" xmlns:r="http://schemas.openxmlformats.org/officeDocument/2006/relationships" xmlns:m="http://schemas.openxmlformats.org/officeDocument/2006/math" xmlns:v="urn:schemas-microsoft-com:vml" xmlns:wp14="http://schemas.microsoft.com/office/word/2010/wordprocessingDrawing" xmlns:wp="http://schemas.openxmlformats.org/drawingml/2006/wordprocessingDrawing" xmlns:w10="urn:schemas-microsoft-com:office:word" xmlns:w="http://schemas.openxmlformats.org/wordprocessingml/2006/main" xmlns:w14="http://schemas.microsoft.com/office/word/2010/wordml" xmlns:w15="http://schemas.microsoft.com/office/word/2012/wordml" xmlns:w16cex="http://schemas.microsoft.com/office/word/2018/wordml/cex" xmlns:w16cid="http://schemas.microsoft.com/office/word/2016/wordml/cid" xmlns:w16="http://schemas.microsoft.com/office/word/2018/wordml" xmlns:w16du="http://schemas.microsoft.com/office/word/2023/wordml/word16du" xmlns:w16sdtdh="http://schemas.microsoft.com/office/word/2020/wordml/sdtdatahash" xmlns:w16sdtfl="http://schemas.microsoft.com/office/word/2024/wordml/sdtformatlock" xmlns:w16se="http://schemas.microsoft.com/office/word/2015/wordml/symex" xmlns:wpg="http://schemas.microsoft.com/office/word/2010/wordprocessingGroup" xmlns:wpi="http://schemas.microsoft.com/office/word/2010/wordprocessingInk" xmlns:wne="http://schemas.microsoft.com/office/word/2006/wordml" xmlns:wps="http://schemas.microsoft.com/office/word/2010/wordprocessingShape" mc:Ignorable="w14 w15 w16se w16cid w16 w16cex w16sdtdh w16sdtfl w16du wp14">
   <w:footnote w:type="separator" w:id="-1">
     <w:p>
       <w:r>
@@ -784,7 +571,7 @@
 </file>
 
 <file path=word/header1.xml><?xml version="1.0" encoding="utf-8"?>
-<w:hdr xmlns:wpc="http://schemas.microsoft.com/office/word/2010/wordprocessingCanvas" xmlns:cx="http://schemas.microsoft.com/office/drawing/2014/chartex" xmlns:cx1="http://schemas.microsoft.com/office/drawing/2015/9/8/chartex" xmlns:cx2="http://schemas.microsoft.com/office/drawing/2015/10/21/chartex" xmlns:cx3="http://schemas.microsoft.com/office/drawing/2016/5/9/chartex" xmlns:cx4="http://schemas.microsoft.com/office/drawing/2016/5/10/chartex" xmlns:cx5="http://schemas.microsoft.com/office/drawing/2016/5/11/chartex" xmlns:cx6="http://schemas.microsoft.com/office/drawing/2016/5/12/chartex" xmlns:cx7="http://schemas.microsoft.com/office/drawing/2016/5/13/chartex" xmlns:cx8="http://schemas.microsoft.com/office/drawing/2016/5/14/chartex" xmlns:mc="http://schemas.openxmlformats.org/markup-compatibility/2006" xmlns:aink="http://schemas.microsoft.com/office/drawing/2016/ink" xmlns:am3d="http://schemas.microsoft.com/office/drawing/2017/model3d" xmlns:o="urn:schemas-microsoft-com:office:office" xmlns:oel="http://schemas.microsoft.com/office/2019/extlst" xmlns:r="http://schemas.openxmlformats.org/officeDocument/2006/relationships" xmlns:m="http://schemas.openxmlformats.org/officeDocument/2006/math" xmlns:v="urn:schemas-microsoft-com:vml" xmlns:wp14="http://schemas.microsoft.com/office/word/2010/wordprocessingDrawing" xmlns:wp="http://schemas.openxmlformats.org/drawingml/2006/wordprocessingDrawing" xmlns:w10="urn:schemas-microsoft-com:office:word" xmlns:w="http://schemas.openxmlformats.org/wordprocessingml/2006/main" xmlns:w14="http://schemas.microsoft.com/office/word/2010/wordml" xmlns:w15="http://schemas.microsoft.com/office/word/2012/wordml" xmlns:w16cex="http://schemas.microsoft.com/office/word/2018/wordml/cex" xmlns:w16cid="http://schemas.microsoft.com/office/word/2016/wordml/cid" xmlns:w16="http://schemas.microsoft.com/office/word/2018/wordml" xmlns:w16sdtdh="http://schemas.microsoft.com/office/word/2020/wordml/sdtdatahash" xmlns:w16se="http://schemas.microsoft.com/office/word/2015/wordml/symex" xmlns:wpg="http://schemas.microsoft.com/office/word/2010/wordprocessingGroup" xmlns:wpi="http://schemas.microsoft.com/office/word/2010/wordprocessingInk" xmlns:wne="http://schemas.microsoft.com/office/word/2006/wordml" xmlns:wps="http://schemas.microsoft.com/office/word/2010/wordprocessingShape" mc:Ignorable="w14 w15 w16se w16cid w16 w16cex w16sdtdh wp14">
+<w:hdr xmlns:wpc="http://schemas.microsoft.com/office/word/2010/wordprocessingCanvas" xmlns:cx="http://schemas.microsoft.com/office/drawing/2014/chartex" xmlns:cx1="http://schemas.microsoft.com/office/drawing/2015/9/8/chartex" xmlns:cx2="http://schemas.microsoft.com/office/drawing/2015/10/21/chartex" xmlns:cx3="http://schemas.microsoft.com/office/drawing/2016/5/9/chartex" xmlns:cx4="http://schemas.microsoft.com/office/drawing/2016/5/10/chartex" xmlns:cx5="http://schemas.microsoft.com/office/drawing/2016/5/11/chartex" xmlns:cx6="http://schemas.microsoft.com/office/drawing/2016/5/12/chartex" xmlns:cx7="http://schemas.microsoft.com/office/drawing/2016/5/13/chartex" xmlns:cx8="http://schemas.microsoft.com/office/drawing/2016/5/14/chartex" xmlns:mc="http://schemas.openxmlformats.org/markup-compatibility/2006" xmlns:aink="http://schemas.microsoft.com/office/drawing/2016/ink" xmlns:am3d="http://schemas.microsoft.com/office/drawing/2017/model3d" xmlns:o="urn:schemas-microsoft-com:office:office" xmlns:oel="http://schemas.microsoft.com/office/2019/extlst" xmlns:r="http://schemas.openxmlformats.org/officeDocument/2006/relationships" xmlns:m="http://schemas.openxmlformats.org/officeDocument/2006/math" xmlns:v="urn:schemas-microsoft-com:vml" xmlns:wp14="http://schemas.microsoft.com/office/word/2010/wordprocessingDrawing" xmlns:wp="http://schemas.openxmlformats.org/drawingml/2006/wordprocessingDrawing" xmlns:w10="urn:schemas-microsoft-com:office:word" xmlns:w="http://schemas.openxmlformats.org/wordprocessingml/2006/main" xmlns:w14="http://schemas.microsoft.com/office/word/2010/wordml" xmlns:w15="http://schemas.microsoft.com/office/word/2012/wordml" xmlns:w16cex="http://schemas.microsoft.com/office/word/2018/wordml/cex" xmlns:w16cid="http://schemas.microsoft.com/office/word/2016/wordml/cid" xmlns:w16="http://schemas.microsoft.com/office/word/2018/wordml" xmlns:w16du="http://schemas.microsoft.com/office/word/2023/wordml/word16du" xmlns:w16sdtdh="http://schemas.microsoft.com/office/word/2020/wordml/sdtdatahash" xmlns:w16sdtfl="http://schemas.microsoft.com/office/word/2024/wordml/sdtformatlock" xmlns:w16se="http://schemas.microsoft.com/office/word/2015/wordml/symex" xmlns:wpg="http://schemas.microsoft.com/office/word/2010/wordprocessingGroup" xmlns:wpi="http://schemas.microsoft.com/office/word/2010/wordprocessingInk" xmlns:wne="http://schemas.microsoft.com/office/word/2006/wordml" xmlns:wps="http://schemas.microsoft.com/office/word/2010/wordprocessingShape" mc:Ignorable="w14 w15 w16se w16cid w16 w16cex w16sdtdh w16sdtfl w16du wp14">
   <w:p>
     <w:pPr>
       <w:pStyle w:val="En-tte"/>
@@ -794,7 +581,7 @@
 </file>
 
 <file path=word/header2.xml><?xml version="1.0" encoding="utf-8"?>
-<w:hdr xmlns:wpc="http://schemas.microsoft.com/office/word/2010/wordprocessingCanvas" xmlns:cx="http://schemas.microsoft.com/office/drawing/2014/chartex" xmlns:cx1="http://schemas.microsoft.com/office/drawing/2015/9/8/chartex" xmlns:cx2="http://schemas.microsoft.com/office/drawing/2015/10/21/chartex" xmlns:cx3="http://schemas.microsoft.com/office/drawing/2016/5/9/chartex" xmlns:cx4="http://schemas.microsoft.com/office/drawing/2016/5/10/chartex" xmlns:cx5="http://schemas.microsoft.com/office/drawing/2016/5/11/chartex" xmlns:cx6="http://schemas.microsoft.com/office/drawing/2016/5/12/chartex" xmlns:cx7="http://schemas.microsoft.com/office/drawing/2016/5/13/chartex" xmlns:cx8="http://schemas.microsoft.com/office/drawing/2016/5/14/chartex" xmlns:mc="http://schemas.openxmlformats.org/markup-compatibility/2006" xmlns:aink="http://schemas.microsoft.com/office/drawing/2016/ink" xmlns:am3d="http://schemas.microsoft.com/office/drawing/2017/model3d" xmlns:o="urn:schemas-microsoft-com:office:office" xmlns:oel="http://schemas.microsoft.com/office/2019/extlst" xmlns:r="http://schemas.openxmlformats.org/officeDocument/2006/relationships" xmlns:m="http://schemas.openxmlformats.org/officeDocument/2006/math" xmlns:v="urn:schemas-microsoft-com:vml" xmlns:wp14="http://schemas.microsoft.com/office/word/2010/wordprocessingDrawing" xmlns:wp="http://schemas.openxmlformats.org/drawingml/2006/wordprocessingDrawing" xmlns:w10="urn:schemas-microsoft-com:office:word" xmlns:w="http://schemas.openxmlformats.org/wordprocessingml/2006/main" xmlns:w14="http://schemas.microsoft.com/office/word/2010/wordml" xmlns:w15="http://schemas.microsoft.com/office/word/2012/wordml" xmlns:w16cex="http://schemas.microsoft.com/office/word/2018/wordml/cex" xmlns:w16cid="http://schemas.microsoft.com/office/word/2016/wordml/cid" xmlns:w16="http://schemas.microsoft.com/office/word/2018/wordml" xmlns:w16sdtdh="http://schemas.microsoft.com/office/word/2020/wordml/sdtdatahash" xmlns:w16se="http://schemas.microsoft.com/office/word/2015/wordml/symex" xmlns:wpg="http://schemas.microsoft.com/office/word/2010/wordprocessingGroup" xmlns:wpi="http://schemas.microsoft.com/office/word/2010/wordprocessingInk" xmlns:wne="http://schemas.microsoft.com/office/word/2006/wordml" xmlns:wps="http://schemas.microsoft.com/office/word/2010/wordprocessingShape" mc:Ignorable="w14 w15 w16se w16cid w16 w16cex w16sdtdh wp14">
+<w:hdr xmlns:wpc="http://schemas.microsoft.com/office/word/2010/wordprocessingCanvas" xmlns:cx="http://schemas.microsoft.com/office/drawing/2014/chartex" xmlns:cx1="http://schemas.microsoft.com/office/drawing/2015/9/8/chartex" xmlns:cx2="http://schemas.microsoft.com/office/drawing/2015/10/21/chartex" xmlns:cx3="http://schemas.microsoft.com/office/drawing/2016/5/9/chartex" xmlns:cx4="http://schemas.microsoft.com/office/drawing/2016/5/10/chartex" xmlns:cx5="http://schemas.microsoft.com/office/drawing/2016/5/11/chartex" xmlns:cx6="http://schemas.microsoft.com/office/drawing/2016/5/12/chartex" xmlns:cx7="http://schemas.microsoft.com/office/drawing/2016/5/13/chartex" xmlns:cx8="http://schemas.microsoft.com/office/drawing/2016/5/14/chartex" xmlns:mc="http://schemas.openxmlformats.org/markup-compatibility/2006" xmlns:aink="http://schemas.microsoft.com/office/drawing/2016/ink" xmlns:am3d="http://schemas.microsoft.com/office/drawing/2017/model3d" xmlns:o="urn:schemas-microsoft-com:office:office" xmlns:oel="http://schemas.microsoft.com/office/2019/extlst" xmlns:r="http://schemas.openxmlformats.org/officeDocument/2006/relationships" xmlns:m="http://schemas.openxmlformats.org/officeDocument/2006/math" xmlns:v="urn:schemas-microsoft-com:vml" xmlns:wp14="http://schemas.microsoft.com/office/word/2010/wordprocessingDrawing" xmlns:wp="http://schemas.openxmlformats.org/drawingml/2006/wordprocessingDrawing" xmlns:w10="urn:schemas-microsoft-com:office:word" xmlns:w="http://schemas.openxmlformats.org/wordprocessingml/2006/main" xmlns:w14="http://schemas.microsoft.com/office/word/2010/wordml" xmlns:w15="http://schemas.microsoft.com/office/word/2012/wordml" xmlns:w16cex="http://schemas.microsoft.com/office/word/2018/wordml/cex" xmlns:w16cid="http://schemas.microsoft.com/office/word/2016/wordml/cid" xmlns:w16="http://schemas.microsoft.com/office/word/2018/wordml" xmlns:w16du="http://schemas.microsoft.com/office/word/2023/wordml/word16du" xmlns:w16sdtdh="http://schemas.microsoft.com/office/word/2020/wordml/sdtdatahash" xmlns:w16sdtfl="http://schemas.microsoft.com/office/word/2024/wordml/sdtformatlock" xmlns:w16se="http://schemas.microsoft.com/office/word/2015/wordml/symex" xmlns:wpg="http://schemas.microsoft.com/office/word/2010/wordprocessingGroup" xmlns:wpi="http://schemas.microsoft.com/office/word/2010/wordprocessingInk" xmlns:wne="http://schemas.microsoft.com/office/word/2006/wordml" xmlns:wps="http://schemas.microsoft.com/office/word/2010/wordprocessingShape" mc:Ignorable="w14 w15 w16se w16cid w16 w16cex w16sdtdh w16sdtfl w16du wp14">
   <w:p>
     <w:pPr>
       <w:pStyle w:val="En-tte"/>
@@ -890,7 +677,7 @@
 </file>
 
 <file path=word/numbering.xml><?xml version="1.0" encoding="utf-8"?>
-<w:numbering xmlns:wpc="http://schemas.microsoft.com/office/word/2010/wordprocessingCanvas" xmlns:cx="http://schemas.microsoft.com/office/drawing/2014/chartex" xmlns:cx1="http://schemas.microsoft.com/office/drawing/2015/9/8/chartex" xmlns:cx2="http://schemas.microsoft.com/office/drawing/2015/10/21/chartex" xmlns:cx3="http://schemas.microsoft.com/office/drawing/2016/5/9/chartex" xmlns:cx4="http://schemas.microsoft.com/office/drawing/2016/5/10/chartex" xmlns:cx5="http://schemas.microsoft.com/office/drawing/2016/5/11/chartex" xmlns:cx6="http://schemas.microsoft.com/office/drawing/2016/5/12/chartex" xmlns:cx7="http://schemas.microsoft.com/office/drawing/2016/5/13/chartex" xmlns:cx8="http://schemas.microsoft.com/office/drawing/2016/5/14/chartex" xmlns:mc="http://schemas.openxmlformats.org/markup-compatibility/2006" xmlns:aink="http://schemas.microsoft.com/office/drawing/2016/ink" xmlns:am3d="http://schemas.microsoft.com/office/drawing/2017/model3d" xmlns:o="urn:schemas-microsoft-com:office:office" xmlns:oel="http://schemas.microsoft.com/office/2019/extlst" xmlns:r="http://schemas.openxmlformats.org/officeDocument/2006/relationships" xmlns:m="http://schemas.openxmlformats.org/officeDocument/2006/math" xmlns:v="urn:schemas-microsoft-com:vml" xmlns:wp14="http://schemas.microsoft.com/office/word/2010/wordprocessingDrawing" xmlns:wp="http://schemas.openxmlformats.org/drawingml/2006/wordprocessingDrawing" xmlns:w10="urn:schemas-microsoft-com:office:word" xmlns:w="http://schemas.openxmlformats.org/wordprocessingml/2006/main" xmlns:w14="http://schemas.microsoft.com/office/word/2010/wordml" xmlns:w15="http://schemas.microsoft.com/office/word/2012/wordml" xmlns:w16cex="http://schemas.microsoft.com/office/word/2018/wordml/cex" xmlns:w16cid="http://schemas.microsoft.com/office/word/2016/wordml/cid" xmlns:w16="http://schemas.microsoft.com/office/word/2018/wordml" xmlns:w16sdtdh="http://schemas.microsoft.com/office/word/2020/wordml/sdtdatahash" xmlns:w16se="http://schemas.microsoft.com/office/word/2015/wordml/symex" xmlns:wpg="http://schemas.microsoft.com/office/word/2010/wordprocessingGroup" xmlns:wpi="http://schemas.microsoft.com/office/word/2010/wordprocessingInk" xmlns:wne="http://schemas.microsoft.com/office/word/2006/wordml" xmlns:wps="http://schemas.microsoft.com/office/word/2010/wordprocessingShape" mc:Ignorable="w14 w15 w16se w16cid w16 w16cex w16sdtdh wp14">
+<w:numbering xmlns:wpc="http://schemas.microsoft.com/office/word/2010/wordprocessingCanvas" xmlns:cx="http://schemas.microsoft.com/office/drawing/2014/chartex" xmlns:cx1="http://schemas.microsoft.com/office/drawing/2015/9/8/chartex" xmlns:cx2="http://schemas.microsoft.com/office/drawing/2015/10/21/chartex" xmlns:cx3="http://schemas.microsoft.com/office/drawing/2016/5/9/chartex" xmlns:cx4="http://schemas.microsoft.com/office/drawing/2016/5/10/chartex" xmlns:cx5="http://schemas.microsoft.com/office/drawing/2016/5/11/chartex" xmlns:cx6="http://schemas.microsoft.com/office/drawing/2016/5/12/chartex" xmlns:cx7="http://schemas.microsoft.com/office/drawing/2016/5/13/chartex" xmlns:cx8="http://schemas.microsoft.com/office/drawing/2016/5/14/chartex" xmlns:mc="http://schemas.openxmlformats.org/markup-compatibility/2006" xmlns:aink="http://schemas.microsoft.com/office/drawing/2016/ink" xmlns:am3d="http://schemas.microsoft.com/office/drawing/2017/model3d" xmlns:o="urn:schemas-microsoft-com:office:office" xmlns:oel="http://schemas.microsoft.com/office/2019/extlst" xmlns:r="http://schemas.openxmlformats.org/officeDocument/2006/relationships" xmlns:m="http://schemas.openxmlformats.org/officeDocument/2006/math" xmlns:v="urn:schemas-microsoft-com:vml" xmlns:wp14="http://schemas.microsoft.com/office/word/2010/wordprocessingDrawing" xmlns:wp="http://schemas.openxmlformats.org/drawingml/2006/wordprocessingDrawing" xmlns:w10="urn:schemas-microsoft-com:office:word" xmlns:w="http://schemas.openxmlformats.org/wordprocessingml/2006/main" xmlns:w14="http://schemas.microsoft.com/office/word/2010/wordml" xmlns:w15="http://schemas.microsoft.com/office/word/2012/wordml" xmlns:w16cex="http://schemas.microsoft.com/office/word/2018/wordml/cex" xmlns:w16cid="http://schemas.microsoft.com/office/word/2016/wordml/cid" xmlns:w16="http://schemas.microsoft.com/office/word/2018/wordml" xmlns:w16du="http://schemas.microsoft.com/office/word/2023/wordml/word16du" xmlns:w16sdtdh="http://schemas.microsoft.com/office/word/2020/wordml/sdtdatahash" xmlns:w16sdtfl="http://schemas.microsoft.com/office/word/2024/wordml/sdtformatlock" xmlns:w16se="http://schemas.microsoft.com/office/word/2015/wordml/symex" xmlns:wpg="http://schemas.microsoft.com/office/word/2010/wordprocessingGroup" xmlns:wpi="http://schemas.microsoft.com/office/word/2010/wordprocessingInk" xmlns:wne="http://schemas.microsoft.com/office/word/2006/wordml" xmlns:wps="http://schemas.microsoft.com/office/word/2010/wordprocessingShape" mc:Ignorable="w14 w15 w16se w16cid w16 w16cex w16sdtdh w16sdtfl w16du wp14">
   <w:abstractNum w:abstractNumId="0" w15:restartNumberingAfterBreak="0">
     <w:nsid w:val="027A2B87"/>
     <w:multiLevelType w:val="multilevel"/>
@@ -904,6 +691,119 @@
     <w:numStyleLink w:val="ListeH"/>
   </w:abstractNum>
   <w:abstractNum w:abstractNumId="2" w15:restartNumberingAfterBreak="0">
+    <w:nsid w:val="062910CF"/>
+    <w:multiLevelType w:val="hybridMultilevel"/>
+    <w:tmpl w:val="2318AAC2"/>
+    <w:lvl w:ilvl="0" w:tplc="0C0C0001">
+      <w:start w:val="1"/>
+      <w:numFmt w:val="bullet"/>
+      <w:lvlText w:val=""/>
+      <w:lvlJc w:val="left"/>
+      <w:pPr>
+        <w:ind w:left="720" w:hanging="360"/>
+      </w:pPr>
+      <w:rPr>
+        <w:rFonts w:ascii="Symbol" w:hAnsi="Symbol" w:hint="default"/>
+      </w:rPr>
+    </w:lvl>
+    <w:lvl w:ilvl="1" w:tplc="0C0C0003" w:tentative="1">
+      <w:start w:val="1"/>
+      <w:numFmt w:val="bullet"/>
+      <w:lvlText w:val="o"/>
+      <w:lvlJc w:val="left"/>
+      <w:pPr>
+        <w:ind w:left="1440" w:hanging="360"/>
+      </w:pPr>
+      <w:rPr>
+        <w:rFonts w:ascii="Courier New" w:hAnsi="Courier New" w:cs="Courier New" w:hint="default"/>
+      </w:rPr>
+    </w:lvl>
+    <w:lvl w:ilvl="2" w:tplc="0C0C0005" w:tentative="1">
+      <w:start w:val="1"/>
+      <w:numFmt w:val="bullet"/>
+      <w:lvlText w:val=""/>
+      <w:lvlJc w:val="left"/>
+      <w:pPr>
+        <w:ind w:left="2160" w:hanging="360"/>
+      </w:pPr>
+      <w:rPr>
+        <w:rFonts w:ascii="Wingdings" w:hAnsi="Wingdings" w:hint="default"/>
+      </w:rPr>
+    </w:lvl>
+    <w:lvl w:ilvl="3" w:tplc="0C0C0001" w:tentative="1">
+      <w:start w:val="1"/>
+      <w:numFmt w:val="bullet"/>
+      <w:lvlText w:val=""/>
+      <w:lvlJc w:val="left"/>
+      <w:pPr>
+        <w:ind w:left="2880" w:hanging="360"/>
+      </w:pPr>
+      <w:rPr>
+        <w:rFonts w:ascii="Symbol" w:hAnsi="Symbol" w:hint="default"/>
+      </w:rPr>
+    </w:lvl>
+    <w:lvl w:ilvl="4" w:tplc="0C0C0003" w:tentative="1">
+      <w:start w:val="1"/>
+      <w:numFmt w:val="bullet"/>
+      <w:lvlText w:val="o"/>
+      <w:lvlJc w:val="left"/>
+      <w:pPr>
+        <w:ind w:left="3600" w:hanging="360"/>
+      </w:pPr>
+      <w:rPr>
+        <w:rFonts w:ascii="Courier New" w:hAnsi="Courier New" w:cs="Courier New" w:hint="default"/>
+      </w:rPr>
+    </w:lvl>
+    <w:lvl w:ilvl="5" w:tplc="0C0C0005" w:tentative="1">
+      <w:start w:val="1"/>
+      <w:numFmt w:val="bullet"/>
+      <w:lvlText w:val=""/>
+      <w:lvlJc w:val="left"/>
+      <w:pPr>
+        <w:ind w:left="4320" w:hanging="360"/>
+      </w:pPr>
+      <w:rPr>
+        <w:rFonts w:ascii="Wingdings" w:hAnsi="Wingdings" w:hint="default"/>
+      </w:rPr>
+    </w:lvl>
+    <w:lvl w:ilvl="6" w:tplc="0C0C0001" w:tentative="1">
+      <w:start w:val="1"/>
+      <w:numFmt w:val="bullet"/>
+      <w:lvlText w:val=""/>
+      <w:lvlJc w:val="left"/>
+      <w:pPr>
+        <w:ind w:left="5040" w:hanging="360"/>
+      </w:pPr>
+      <w:rPr>
+        <w:rFonts w:ascii="Symbol" w:hAnsi="Symbol" w:hint="default"/>
+      </w:rPr>
+    </w:lvl>
+    <w:lvl w:ilvl="7" w:tplc="0C0C0003" w:tentative="1">
+      <w:start w:val="1"/>
+      <w:numFmt w:val="bullet"/>
+      <w:lvlText w:val="o"/>
+      <w:lvlJc w:val="left"/>
+      <w:pPr>
+        <w:ind w:left="5760" w:hanging="360"/>
+      </w:pPr>
+      <w:rPr>
+        <w:rFonts w:ascii="Courier New" w:hAnsi="Courier New" w:cs="Courier New" w:hint="default"/>
+      </w:rPr>
+    </w:lvl>
+    <w:lvl w:ilvl="8" w:tplc="0C0C0005" w:tentative="1">
+      <w:start w:val="1"/>
+      <w:numFmt w:val="bullet"/>
+      <w:lvlText w:val=""/>
+      <w:lvlJc w:val="left"/>
+      <w:pPr>
+        <w:ind w:left="6480" w:hanging="360"/>
+      </w:pPr>
+      <w:rPr>
+        <w:rFonts w:ascii="Wingdings" w:hAnsi="Wingdings" w:hint="default"/>
+      </w:rPr>
+    </w:lvl>
+  </w:abstractNum>
+  <w:abstractNum w:abstractNumId="3" w15:restartNumberingAfterBreak="0">
     <w:nsid w:val="07DD4962"/>
     <w:multiLevelType w:val="multilevel"/>
     <w:tmpl w:val="739C9778"/>
@@ -1022,7 +922,7 @@
       </w:rPr>
     </w:lvl>
   </w:abstractNum>
-  <w:abstractNum w:abstractNumId="3" w15:restartNumberingAfterBreak="0">
+  <w:abstractNum w:abstractNumId="4" w15:restartNumberingAfterBreak="0">
     <w:nsid w:val="084912CE"/>
     <w:multiLevelType w:val="multilevel"/>
     <w:tmpl w:val="043E290A"/>
@@ -1135,7 +1035,7 @@
       </w:pPr>
     </w:lvl>
   </w:abstractNum>
-  <w:abstractNum w:abstractNumId="4" w15:restartNumberingAfterBreak="0">
+  <w:abstractNum w:abstractNumId="5" w15:restartNumberingAfterBreak="0">
     <w:nsid w:val="096F0EE1"/>
     <w:multiLevelType w:val="multilevel"/>
     <w:tmpl w:val="975E70A6"/>
@@ -1221,7 +1121,7 @@
       </w:pPr>
     </w:lvl>
   </w:abstractNum>
-  <w:abstractNum w:abstractNumId="5" w15:restartNumberingAfterBreak="0">
+  <w:abstractNum w:abstractNumId="6" w15:restartNumberingAfterBreak="0">
     <w:nsid w:val="11D9558E"/>
     <w:multiLevelType w:val="multilevel"/>
     <w:tmpl w:val="3A02D272"/>
@@ -1360,13 +1260,13 @@
       </w:rPr>
     </w:lvl>
   </w:abstractNum>
-  <w:abstractNum w:abstractNumId="6" w15:restartNumberingAfterBreak="0">
+  <w:abstractNum w:abstractNumId="7" w15:restartNumberingAfterBreak="0">
     <w:nsid w:val="179D1D90"/>
     <w:multiLevelType w:val="multilevel"/>
     <w:tmpl w:val="739C9778"/>
     <w:numStyleLink w:val="ListeH"/>
   </w:abstractNum>
-  <w:abstractNum w:abstractNumId="7" w15:restartNumberingAfterBreak="0">
+  <w:abstractNum w:abstractNumId="8" w15:restartNumberingAfterBreak="0">
     <w:nsid w:val="1B96015D"/>
     <w:multiLevelType w:val="hybridMultilevel"/>
     <w:tmpl w:val="ED8E208E"/>
@@ -1452,7 +1352,7 @@
       </w:pPr>
     </w:lvl>
   </w:abstractNum>
-  <w:abstractNum w:abstractNumId="8" w15:restartNumberingAfterBreak="0">
+  <w:abstractNum w:abstractNumId="9" w15:restartNumberingAfterBreak="0">
     <w:nsid w:val="1DFC0B02"/>
     <w:multiLevelType w:val="multilevel"/>
     <w:tmpl w:val="176835A6"/>
@@ -1591,7 +1491,7 @@
       </w:rPr>
     </w:lvl>
   </w:abstractNum>
-  <w:abstractNum w:abstractNumId="9" w15:restartNumberingAfterBreak="0">
+  <w:abstractNum w:abstractNumId="10" w15:restartNumberingAfterBreak="0">
     <w:nsid w:val="25AB3FE7"/>
     <w:multiLevelType w:val="multilevel"/>
     <w:tmpl w:val="6A687D70"/>
@@ -1730,7 +1630,7 @@
       </w:rPr>
     </w:lvl>
   </w:abstractNum>
-  <w:abstractNum w:abstractNumId="10" w15:restartNumberingAfterBreak="0">
+  <w:abstractNum w:abstractNumId="11" w15:restartNumberingAfterBreak="0">
     <w:nsid w:val="2A9A0C48"/>
     <w:multiLevelType w:val="multilevel"/>
     <w:tmpl w:val="C9821AEC"/>
@@ -1879,7 +1779,7 @@
       </w:rPr>
     </w:lvl>
   </w:abstractNum>
-  <w:abstractNum w:abstractNumId="11" w15:restartNumberingAfterBreak="0">
+  <w:abstractNum w:abstractNumId="12" w15:restartNumberingAfterBreak="0">
     <w:nsid w:val="358623EA"/>
     <w:multiLevelType w:val="hybridMultilevel"/>
     <w:tmpl w:val="4C106E14"/>
@@ -1992,7 +1892,7 @@
       </w:rPr>
     </w:lvl>
   </w:abstractNum>
-  <w:abstractNum w:abstractNumId="12" w15:restartNumberingAfterBreak="0">
+  <w:abstractNum w:abstractNumId="13" w15:restartNumberingAfterBreak="0">
     <w:nsid w:val="3B340AB9"/>
     <w:multiLevelType w:val="hybridMultilevel"/>
     <w:tmpl w:val="00180BBA"/>
@@ -2105,13 +2005,13 @@
       </w:rPr>
     </w:lvl>
   </w:abstractNum>
-  <w:abstractNum w:abstractNumId="13" w15:restartNumberingAfterBreak="0">
+  <w:abstractNum w:abstractNumId="14" w15:restartNumberingAfterBreak="0">
     <w:nsid w:val="3E865E07"/>
     <w:multiLevelType w:val="multilevel"/>
     <w:tmpl w:val="739C9778"/>
     <w:numStyleLink w:val="ListeH"/>
   </w:abstractNum>
-  <w:abstractNum w:abstractNumId="14" w15:restartNumberingAfterBreak="0">
+  <w:abstractNum w:abstractNumId="15" w15:restartNumberingAfterBreak="0">
     <w:nsid w:val="430D790D"/>
     <w:multiLevelType w:val="hybridMultilevel"/>
     <w:tmpl w:val="7876A42C"/>
@@ -2200,13 +2100,13 @@
       </w:pPr>
     </w:lvl>
   </w:abstractNum>
-  <w:abstractNum w:abstractNumId="15" w15:restartNumberingAfterBreak="0">
+  <w:abstractNum w:abstractNumId="16" w15:restartNumberingAfterBreak="0">
     <w:nsid w:val="43195235"/>
     <w:multiLevelType w:val="multilevel"/>
     <w:tmpl w:val="739C9778"/>
     <w:numStyleLink w:val="ListeH"/>
   </w:abstractNum>
-  <w:abstractNum w:abstractNumId="16" w15:restartNumberingAfterBreak="0">
+  <w:abstractNum w:abstractNumId="17" w15:restartNumberingAfterBreak="0">
     <w:nsid w:val="47DE4B69"/>
     <w:multiLevelType w:val="multilevel"/>
     <w:tmpl w:val="A05EE2CE"/>
@@ -2319,7 +2219,7 @@
       </w:rPr>
     </w:lvl>
   </w:abstractNum>
-  <w:abstractNum w:abstractNumId="17" w15:restartNumberingAfterBreak="0">
+  <w:abstractNum w:abstractNumId="18" w15:restartNumberingAfterBreak="0">
     <w:nsid w:val="4B455453"/>
     <w:multiLevelType w:val="hybridMultilevel"/>
     <w:tmpl w:val="7A60430E"/>
@@ -2459,7 +2359,7 @@
       </w:rPr>
     </w:lvl>
   </w:abstractNum>
-  <w:abstractNum w:abstractNumId="18" w15:restartNumberingAfterBreak="0">
+  <w:abstractNum w:abstractNumId="19" w15:restartNumberingAfterBreak="0">
     <w:nsid w:val="4E067E73"/>
     <w:multiLevelType w:val="multilevel"/>
     <w:tmpl w:val="49B86426"/>
@@ -2600,13 +2500,13 @@
       </w:rPr>
     </w:lvl>
   </w:abstractNum>
-  <w:abstractNum w:abstractNumId="19" w15:restartNumberingAfterBreak="0">
+  <w:abstractNum w:abstractNumId="20" w15:restartNumberingAfterBreak="0">
     <w:nsid w:val="5A815FE1"/>
     <w:multiLevelType w:val="multilevel"/>
     <w:tmpl w:val="739C9778"/>
     <w:numStyleLink w:val="ListeH"/>
   </w:abstractNum>
-  <w:abstractNum w:abstractNumId="20" w15:restartNumberingAfterBreak="0">
+  <w:abstractNum w:abstractNumId="21" w15:restartNumberingAfterBreak="0">
     <w:nsid w:val="5F836F83"/>
     <w:multiLevelType w:val="multilevel"/>
     <w:tmpl w:val="5AB09C6A"/>
@@ -2728,7 +2628,7 @@
       </w:rPr>
     </w:lvl>
   </w:abstractNum>
-  <w:abstractNum w:abstractNumId="21" w15:restartNumberingAfterBreak="0">
+  <w:abstractNum w:abstractNumId="22" w15:restartNumberingAfterBreak="0">
     <w:nsid w:val="60E5091D"/>
     <w:multiLevelType w:val="hybridMultilevel"/>
     <w:tmpl w:val="5DAAAC76"/>
@@ -2840,19 +2740,19 @@
       </w:rPr>
     </w:lvl>
   </w:abstractNum>
-  <w:abstractNum w:abstractNumId="22" w15:restartNumberingAfterBreak="0">
+  <w:abstractNum w:abstractNumId="23" w15:restartNumberingAfterBreak="0">
     <w:nsid w:val="6748701B"/>
     <w:multiLevelType w:val="multilevel"/>
     <w:tmpl w:val="739C9778"/>
     <w:numStyleLink w:val="ListeH"/>
   </w:abstractNum>
-  <w:abstractNum w:abstractNumId="23" w15:restartNumberingAfterBreak="0">
+  <w:abstractNum w:abstractNumId="24" w15:restartNumberingAfterBreak="0">
     <w:nsid w:val="68B70017"/>
     <w:multiLevelType w:val="multilevel"/>
     <w:tmpl w:val="739C9778"/>
     <w:numStyleLink w:val="ListeH"/>
   </w:abstractNum>
-  <w:abstractNum w:abstractNumId="24" w15:restartNumberingAfterBreak="0">
+  <w:abstractNum w:abstractNumId="25" w15:restartNumberingAfterBreak="0">
     <w:nsid w:val="74B75755"/>
     <w:multiLevelType w:val="multilevel"/>
     <w:tmpl w:val="923220C8"/>
@@ -2966,13 +2866,13 @@
       </w:rPr>
     </w:lvl>
   </w:abstractNum>
-  <w:abstractNum w:abstractNumId="25" w15:restartNumberingAfterBreak="0">
+  <w:abstractNum w:abstractNumId="26" w15:restartNumberingAfterBreak="0">
     <w:nsid w:val="77B35512"/>
     <w:multiLevelType w:val="multilevel"/>
     <w:tmpl w:val="739C9778"/>
     <w:numStyleLink w:val="ListeH"/>
   </w:abstractNum>
-  <w:abstractNum w:abstractNumId="26" w15:restartNumberingAfterBreak="0">
+  <w:abstractNum w:abstractNumId="27" w15:restartNumberingAfterBreak="0">
     <w:nsid w:val="7A670DEC"/>
     <w:multiLevelType w:val="hybridMultilevel"/>
     <w:tmpl w:val="A0AC7D7C"/>
@@ -3086,7 +2986,7 @@
       </w:rPr>
     </w:lvl>
   </w:abstractNum>
-  <w:abstractNum w:abstractNumId="27" w15:restartNumberingAfterBreak="0">
+  <w:abstractNum w:abstractNumId="28" w15:restartNumberingAfterBreak="0">
     <w:nsid w:val="7A7357F4"/>
     <w:multiLevelType w:val="multilevel"/>
     <w:tmpl w:val="BBBA5062"/>
@@ -3199,7 +3099,119 @@
       </w:rPr>
     </w:lvl>
   </w:abstractNum>
-  <w:abstractNum w:abstractNumId="28" w15:restartNumberingAfterBreak="0">
+  <w:abstractNum w:abstractNumId="29" w15:restartNumberingAfterBreak="0">
+    <w:nsid w:val="7CBC0373"/>
+    <w:multiLevelType w:val="hybridMultilevel"/>
+    <w:tmpl w:val="5CF22C1A"/>
+    <w:lvl w:ilvl="0" w:tplc="EB8E2DA4">
+      <w:numFmt w:val="bullet"/>
+      <w:lvlText w:val="•"/>
+      <w:lvlJc w:val="left"/>
+      <w:pPr>
+        <w:ind w:left="720" w:hanging="360"/>
+      </w:pPr>
+      <w:rPr>
+        <w:rFonts w:ascii="FiraGO" w:eastAsiaTheme="minorHAnsi" w:hAnsi="FiraGO" w:cs="FiraGO" w:hint="default"/>
+      </w:rPr>
+    </w:lvl>
+    <w:lvl w:ilvl="1" w:tplc="0C0C0003" w:tentative="1">
+      <w:start w:val="1"/>
+      <w:numFmt w:val="bullet"/>
+      <w:lvlText w:val="o"/>
+      <w:lvlJc w:val="left"/>
+      <w:pPr>
+        <w:ind w:left="1440" w:hanging="360"/>
+      </w:pPr>
+      <w:rPr>
+        <w:rFonts w:ascii="Courier New" w:hAnsi="Courier New" w:cs="Courier New" w:hint="default"/>
+      </w:rPr>
+    </w:lvl>
+    <w:lvl w:ilvl="2" w:tplc="0C0C0005" w:tentative="1">
+      <w:start w:val="1"/>
+      <w:numFmt w:val="bullet"/>
+      <w:lvlText w:val=""/>
+      <w:lvlJc w:val="left"/>
+      <w:pPr>
+        <w:ind w:left="2160" w:hanging="360"/>
+      </w:pPr>
+      <w:rPr>
+        <w:rFonts w:ascii="Wingdings" w:hAnsi="Wingdings" w:hint="default"/>
+      </w:rPr>
+    </w:lvl>
+    <w:lvl w:ilvl="3" w:tplc="0C0C0001" w:tentative="1">
+      <w:start w:val="1"/>
+      <w:numFmt w:val="bullet"/>
+      <w:lvlText w:val=""/>
+      <w:lvlJc w:val="left"/>
+      <w:pPr>
+        <w:ind w:left="2880" w:hanging="360"/>
+      </w:pPr>
+      <w:rPr>
+        <w:rFonts w:ascii="Symbol" w:hAnsi="Symbol" w:hint="default"/>
+      </w:rPr>
+    </w:lvl>
+    <w:lvl w:ilvl="4" w:tplc="0C0C0003" w:tentative="1">
+      <w:start w:val="1"/>
+      <w:numFmt w:val="bullet"/>
+      <w:lvlText w:val="o"/>
+      <w:lvlJc w:val="left"/>
+      <w:pPr>
+        <w:ind w:left="3600" w:hanging="360"/>
+      </w:pPr>
+      <w:rPr>
+        <w:rFonts w:ascii="Courier New" w:hAnsi="Courier New" w:cs="Courier New" w:hint="default"/>
+      </w:rPr>
+    </w:lvl>
+    <w:lvl w:ilvl="5" w:tplc="0C0C0005" w:tentative="1">
+      <w:start w:val="1"/>
+      <w:numFmt w:val="bullet"/>
+      <w:lvlText w:val=""/>
+      <w:lvlJc w:val="left"/>
+      <w:pPr>
+        <w:ind w:left="4320" w:hanging="360"/>
+      </w:pPr>
+      <w:rPr>
+        <w:rFonts w:ascii="Wingdings" w:hAnsi="Wingdings" w:hint="default"/>
+      </w:rPr>
+    </w:lvl>
+    <w:lvl w:ilvl="6" w:tplc="0C0C0001" w:tentative="1">
+      <w:start w:val="1"/>
+      <w:numFmt w:val="bullet"/>
+      <w:lvlText w:val=""/>
+      <w:lvlJc w:val="left"/>
+      <w:pPr>
+        <w:ind w:left="5040" w:hanging="360"/>
+      </w:pPr>
+      <w:rPr>
+        <w:rFonts w:ascii="Symbol" w:hAnsi="Symbol" w:hint="default"/>
+      </w:rPr>
+    </w:lvl>
+    <w:lvl w:ilvl="7" w:tplc="0C0C0003" w:tentative="1">
+      <w:start w:val="1"/>
+      <w:numFmt w:val="bullet"/>
+      <w:lvlText w:val="o"/>
+      <w:lvlJc w:val="left"/>
+      <w:pPr>
+        <w:ind w:left="5760" w:hanging="360"/>
+      </w:pPr>
+      <w:rPr>
+        <w:rFonts w:ascii="Courier New" w:hAnsi="Courier New" w:cs="Courier New" w:hint="default"/>
+      </w:rPr>
+    </w:lvl>
+    <w:lvl w:ilvl="8" w:tplc="0C0C0005" w:tentative="1">
+      <w:start w:val="1"/>
+      <w:numFmt w:val="bullet"/>
+      <w:lvlText w:val=""/>
+      <w:lvlJc w:val="left"/>
+      <w:pPr>
+        <w:ind w:left="6480" w:hanging="360"/>
+      </w:pPr>
+      <w:rPr>
+        <w:rFonts w:ascii="Wingdings" w:hAnsi="Wingdings" w:hint="default"/>
+      </w:rPr>
+    </w:lvl>
+  </w:abstractNum>
+  <w:abstractNum w:abstractNumId="30" w15:restartNumberingAfterBreak="0">
     <w:nsid w:val="7EE90188"/>
     <w:multiLevelType w:val="multilevel"/>
     <w:tmpl w:val="679E9E86"/>
@@ -3339,218 +3351,224 @@
     </w:lvl>
   </w:abstractNum>
   <w:num w:numId="1" w16cid:durableId="132213507">
-    <w:abstractNumId w:val="2"/>
+    <w:abstractNumId w:val="3"/>
   </w:num>
   <w:num w:numId="2" w16cid:durableId="349642820">
-    <w:abstractNumId w:val="24"/>
+    <w:abstractNumId w:val="25"/>
   </w:num>
   <w:num w:numId="3" w16cid:durableId="1958564120">
+    <w:abstractNumId w:val="27"/>
+  </w:num>
+  <w:num w:numId="4" w16cid:durableId="1770808809">
+    <w:abstractNumId w:val="16"/>
+  </w:num>
+  <w:num w:numId="5" w16cid:durableId="1606308182">
+    <w:abstractNumId w:val="8"/>
+  </w:num>
+  <w:num w:numId="6" w16cid:durableId="310058971">
+    <w:abstractNumId w:val="21"/>
+  </w:num>
+  <w:num w:numId="7" w16cid:durableId="1708870589">
     <w:abstractNumId w:val="26"/>
   </w:num>
-  <w:num w:numId="4" w16cid:durableId="1770808809">
-    <w:abstractNumId w:val="15"/>
-  </w:num>
-  <w:num w:numId="5" w16cid:durableId="1606308182">
-    <w:abstractNumId w:val="7"/>
-  </w:num>
-  <w:num w:numId="6" w16cid:durableId="310058971">
-    <w:abstractNumId w:val="20"/>
-  </w:num>
-  <w:num w:numId="7" w16cid:durableId="1708870589">
-    <w:abstractNumId w:val="25"/>
-  </w:num>
   <w:num w:numId="8" w16cid:durableId="147553020">
-    <w:abstractNumId w:val="13"/>
+    <w:abstractNumId w:val="14"/>
   </w:num>
   <w:num w:numId="9" w16cid:durableId="1497383522">
     <w:abstractNumId w:val="1"/>
   </w:num>
   <w:num w:numId="10" w16cid:durableId="1375155387">
-    <w:abstractNumId w:val="22"/>
+    <w:abstractNumId w:val="23"/>
   </w:num>
   <w:num w:numId="11" w16cid:durableId="1679692503">
-    <w:abstractNumId w:val="6"/>
+    <w:abstractNumId w:val="7"/>
   </w:num>
   <w:num w:numId="12" w16cid:durableId="1933778632">
     <w:abstractNumId w:val="0"/>
   </w:num>
   <w:num w:numId="13" w16cid:durableId="995963322">
+    <w:abstractNumId w:val="25"/>
+  </w:num>
+  <w:num w:numId="14" w16cid:durableId="690767980">
+    <w:abstractNumId w:val="27"/>
+  </w:num>
+  <w:num w:numId="15" w16cid:durableId="1210343077">
+    <w:abstractNumId w:val="3"/>
+  </w:num>
+  <w:num w:numId="16" w16cid:durableId="1838763775">
+    <w:abstractNumId w:val="21"/>
+  </w:num>
+  <w:num w:numId="17" w16cid:durableId="1123965759">
+    <w:abstractNumId w:val="21"/>
+  </w:num>
+  <w:num w:numId="18" w16cid:durableId="1574390654">
+    <w:abstractNumId w:val="21"/>
+  </w:num>
+  <w:num w:numId="19" w16cid:durableId="1795825943">
+    <w:abstractNumId w:val="21"/>
+  </w:num>
+  <w:num w:numId="20" w16cid:durableId="1934968145">
+    <w:abstractNumId w:val="21"/>
+  </w:num>
+  <w:num w:numId="21" w16cid:durableId="1220554614">
+    <w:abstractNumId w:val="21"/>
+  </w:num>
+  <w:num w:numId="22" w16cid:durableId="1806506025">
+    <w:abstractNumId w:val="21"/>
+  </w:num>
+  <w:num w:numId="23" w16cid:durableId="2120181797">
+    <w:abstractNumId w:val="21"/>
+  </w:num>
+  <w:num w:numId="24" w16cid:durableId="451285327">
+    <w:abstractNumId w:val="21"/>
+  </w:num>
+  <w:num w:numId="25" w16cid:durableId="1641111400">
+    <w:abstractNumId w:val="28"/>
+  </w:num>
+  <w:num w:numId="26" w16cid:durableId="1094595358">
+    <w:abstractNumId w:val="4"/>
+  </w:num>
+  <w:num w:numId="27" w16cid:durableId="2129427489">
+    <w:abstractNumId w:val="5"/>
+  </w:num>
+  <w:num w:numId="28" w16cid:durableId="259415824">
     <w:abstractNumId w:val="24"/>
   </w:num>
-  <w:num w:numId="14" w16cid:durableId="690767980">
-    <w:abstractNumId w:val="26"/>
+  <w:num w:numId="29" w16cid:durableId="625311240">
+    <w:abstractNumId w:val="20"/>
   </w:num>
-  <w:num w:numId="15" w16cid:durableId="1210343077">
+  <w:num w:numId="30" w16cid:durableId="1241058914">
+    <w:abstractNumId w:val="25"/>
+  </w:num>
+  <w:num w:numId="31" w16cid:durableId="1804807438">
+    <w:abstractNumId w:val="27"/>
+  </w:num>
+  <w:num w:numId="32" w16cid:durableId="1105609836">
+    <w:abstractNumId w:val="3"/>
+  </w:num>
+  <w:num w:numId="33" w16cid:durableId="1936283781">
+    <w:abstractNumId w:val="21"/>
+  </w:num>
+  <w:num w:numId="34" w16cid:durableId="964120940">
+    <w:abstractNumId w:val="21"/>
+  </w:num>
+  <w:num w:numId="35" w16cid:durableId="1664166280">
+    <w:abstractNumId w:val="21"/>
+  </w:num>
+  <w:num w:numId="36" w16cid:durableId="1693410550">
+    <w:abstractNumId w:val="21"/>
+  </w:num>
+  <w:num w:numId="37" w16cid:durableId="715928985">
+    <w:abstractNumId w:val="21"/>
+  </w:num>
+  <w:num w:numId="38" w16cid:durableId="1276786005">
+    <w:abstractNumId w:val="21"/>
+  </w:num>
+  <w:num w:numId="39" w16cid:durableId="1112869501">
+    <w:abstractNumId w:val="21"/>
+  </w:num>
+  <w:num w:numId="40" w16cid:durableId="937716831">
+    <w:abstractNumId w:val="21"/>
+  </w:num>
+  <w:num w:numId="41" w16cid:durableId="383404870">
+    <w:abstractNumId w:val="21"/>
+  </w:num>
+  <w:num w:numId="42" w16cid:durableId="492256701">
+    <w:abstractNumId w:val="19"/>
+  </w:num>
+  <w:num w:numId="43" w16cid:durableId="1507331199">
+    <w:abstractNumId w:val="21"/>
+  </w:num>
+  <w:num w:numId="44" w16cid:durableId="2125729332">
+    <w:abstractNumId w:val="21"/>
+  </w:num>
+  <w:num w:numId="45" w16cid:durableId="1877158614">
+    <w:abstractNumId w:val="19"/>
+  </w:num>
+  <w:num w:numId="46" w16cid:durableId="1264607096">
+    <w:abstractNumId w:val="19"/>
+  </w:num>
+  <w:num w:numId="47" w16cid:durableId="702561927">
+    <w:abstractNumId w:val="19"/>
+  </w:num>
+  <w:num w:numId="48" w16cid:durableId="2031684679">
+    <w:abstractNumId w:val="25"/>
+  </w:num>
+  <w:num w:numId="49" w16cid:durableId="1713071580">
+    <w:abstractNumId w:val="27"/>
+  </w:num>
+  <w:num w:numId="50" w16cid:durableId="1217820813">
+    <w:abstractNumId w:val="10"/>
+  </w:num>
+  <w:num w:numId="51" w16cid:durableId="269901520">
+    <w:abstractNumId w:val="30"/>
+  </w:num>
+  <w:num w:numId="52" w16cid:durableId="1404109966">
+    <w:abstractNumId w:val="6"/>
+  </w:num>
+  <w:num w:numId="53" w16cid:durableId="389689506">
+    <w:abstractNumId w:val="9"/>
+  </w:num>
+  <w:num w:numId="54" w16cid:durableId="234705802">
+    <w:abstractNumId w:val="3"/>
+  </w:num>
+  <w:num w:numId="55" w16cid:durableId="613705869">
+    <w:abstractNumId w:val="21"/>
+  </w:num>
+  <w:num w:numId="56" w16cid:durableId="651718309">
+    <w:abstractNumId w:val="21"/>
+  </w:num>
+  <w:num w:numId="57" w16cid:durableId="1161656592">
+    <w:abstractNumId w:val="21"/>
+  </w:num>
+  <w:num w:numId="58" w16cid:durableId="1881279216">
+    <w:abstractNumId w:val="21"/>
+  </w:num>
+  <w:num w:numId="59" w16cid:durableId="1767574390">
+    <w:abstractNumId w:val="21"/>
+  </w:num>
+  <w:num w:numId="60" w16cid:durableId="1314337288">
+    <w:abstractNumId w:val="21"/>
+  </w:num>
+  <w:num w:numId="61" w16cid:durableId="1199900351">
+    <w:abstractNumId w:val="21"/>
+  </w:num>
+  <w:num w:numId="62" w16cid:durableId="1720737257">
+    <w:abstractNumId w:val="21"/>
+  </w:num>
+  <w:num w:numId="63" w16cid:durableId="932473284">
+    <w:abstractNumId w:val="15"/>
+  </w:num>
+  <w:num w:numId="64" w16cid:durableId="766118486">
+    <w:abstractNumId w:val="12"/>
+  </w:num>
+  <w:num w:numId="65" w16cid:durableId="840895423">
+    <w:abstractNumId w:val="17"/>
+  </w:num>
+  <w:num w:numId="66" w16cid:durableId="891621001">
+    <w:abstractNumId w:val="11"/>
+  </w:num>
+  <w:num w:numId="67" w16cid:durableId="313918445">
+    <w:abstractNumId w:val="13"/>
+  </w:num>
+  <w:num w:numId="68" w16cid:durableId="544146418">
+    <w:abstractNumId w:val="18"/>
+  </w:num>
+  <w:num w:numId="69" w16cid:durableId="1895267962">
+    <w:abstractNumId w:val="22"/>
+  </w:num>
+  <w:num w:numId="70" w16cid:durableId="1467358863">
     <w:abstractNumId w:val="2"/>
   </w:num>
-  <w:num w:numId="16" w16cid:durableId="1838763775">
-    <w:abstractNumId w:val="20"/>
-  </w:num>
-  <w:num w:numId="17" w16cid:durableId="1123965759">
-    <w:abstractNumId w:val="20"/>
-  </w:num>
-  <w:num w:numId="18" w16cid:durableId="1574390654">
-    <w:abstractNumId w:val="20"/>
-  </w:num>
-  <w:num w:numId="19" w16cid:durableId="1795825943">
-    <w:abstractNumId w:val="20"/>
-  </w:num>
-  <w:num w:numId="20" w16cid:durableId="1934968145">
-    <w:abstractNumId w:val="20"/>
-  </w:num>
-  <w:num w:numId="21" w16cid:durableId="1220554614">
-    <w:abstractNumId w:val="20"/>
-  </w:num>
-  <w:num w:numId="22" w16cid:durableId="1806506025">
-    <w:abstractNumId w:val="20"/>
-  </w:num>
-  <w:num w:numId="23" w16cid:durableId="2120181797">
-    <w:abstractNumId w:val="20"/>
-  </w:num>
-  <w:num w:numId="24" w16cid:durableId="451285327">
-    <w:abstractNumId w:val="20"/>
-  </w:num>
-  <w:num w:numId="25" w16cid:durableId="1641111400">
-    <w:abstractNumId w:val="27"/>
-  </w:num>
-  <w:num w:numId="26" w16cid:durableId="1094595358">
-    <w:abstractNumId w:val="3"/>
-  </w:num>
-  <w:num w:numId="27" w16cid:durableId="2129427489">
-    <w:abstractNumId w:val="4"/>
-  </w:num>
-  <w:num w:numId="28" w16cid:durableId="259415824">
-    <w:abstractNumId w:val="23"/>
-  </w:num>
-  <w:num w:numId="29" w16cid:durableId="625311240">
-    <w:abstractNumId w:val="19"/>
-  </w:num>
-  <w:num w:numId="30" w16cid:durableId="1241058914">
-    <w:abstractNumId w:val="24"/>
-  </w:num>
-  <w:num w:numId="31" w16cid:durableId="1804807438">
-    <w:abstractNumId w:val="26"/>
-  </w:num>
-  <w:num w:numId="32" w16cid:durableId="1105609836">
-    <w:abstractNumId w:val="2"/>
-  </w:num>
-  <w:num w:numId="33" w16cid:durableId="1936283781">
-    <w:abstractNumId w:val="20"/>
-  </w:num>
-  <w:num w:numId="34" w16cid:durableId="964120940">
-    <w:abstractNumId w:val="20"/>
-  </w:num>
-  <w:num w:numId="35" w16cid:durableId="1664166280">
-    <w:abstractNumId w:val="20"/>
-  </w:num>
-  <w:num w:numId="36" w16cid:durableId="1693410550">
-    <w:abstractNumId w:val="20"/>
-  </w:num>
-  <w:num w:numId="37" w16cid:durableId="715928985">
-    <w:abstractNumId w:val="20"/>
-  </w:num>
-  <w:num w:numId="38" w16cid:durableId="1276786005">
-    <w:abstractNumId w:val="20"/>
-  </w:num>
-  <w:num w:numId="39" w16cid:durableId="1112869501">
-    <w:abstractNumId w:val="20"/>
-  </w:num>
-  <w:num w:numId="40" w16cid:durableId="937716831">
-    <w:abstractNumId w:val="20"/>
-  </w:num>
-  <w:num w:numId="41" w16cid:durableId="383404870">
-    <w:abstractNumId w:val="20"/>
-  </w:num>
-  <w:num w:numId="42" w16cid:durableId="492256701">
-    <w:abstractNumId w:val="18"/>
-  </w:num>
-  <w:num w:numId="43" w16cid:durableId="1507331199">
-    <w:abstractNumId w:val="20"/>
-  </w:num>
-  <w:num w:numId="44" w16cid:durableId="2125729332">
-    <w:abstractNumId w:val="20"/>
-  </w:num>
-  <w:num w:numId="45" w16cid:durableId="1877158614">
-    <w:abstractNumId w:val="18"/>
-  </w:num>
-  <w:num w:numId="46" w16cid:durableId="1264607096">
-    <w:abstractNumId w:val="18"/>
-  </w:num>
-  <w:num w:numId="47" w16cid:durableId="702561927">
-    <w:abstractNumId w:val="18"/>
-  </w:num>
-  <w:num w:numId="48" w16cid:durableId="2031684679">
-    <w:abstractNumId w:val="24"/>
-  </w:num>
-  <w:num w:numId="49" w16cid:durableId="1713071580">
-    <w:abstractNumId w:val="26"/>
-  </w:num>
-  <w:num w:numId="50" w16cid:durableId="1217820813">
-    <w:abstractNumId w:val="9"/>
-  </w:num>
-  <w:num w:numId="51" w16cid:durableId="269901520">
-    <w:abstractNumId w:val="28"/>
-  </w:num>
-  <w:num w:numId="52" w16cid:durableId="1404109966">
-    <w:abstractNumId w:val="5"/>
-  </w:num>
-  <w:num w:numId="53" w16cid:durableId="389689506">
-    <w:abstractNumId w:val="8"/>
-  </w:num>
-  <w:num w:numId="54" w16cid:durableId="234705802">
-    <w:abstractNumId w:val="2"/>
-  </w:num>
-  <w:num w:numId="55" w16cid:durableId="613705869">
-    <w:abstractNumId w:val="20"/>
-  </w:num>
-  <w:num w:numId="56" w16cid:durableId="651718309">
-    <w:abstractNumId w:val="20"/>
-  </w:num>
-  <w:num w:numId="57" w16cid:durableId="1161656592">
-    <w:abstractNumId w:val="20"/>
-  </w:num>
-  <w:num w:numId="58" w16cid:durableId="1881279216">
-    <w:abstractNumId w:val="20"/>
-  </w:num>
-  <w:num w:numId="59" w16cid:durableId="1767574390">
-    <w:abstractNumId w:val="20"/>
-  </w:num>
-  <w:num w:numId="60" w16cid:durableId="1314337288">
-    <w:abstractNumId w:val="20"/>
-  </w:num>
-  <w:num w:numId="61" w16cid:durableId="1199900351">
-    <w:abstractNumId w:val="20"/>
-  </w:num>
-  <w:num w:numId="62" w16cid:durableId="1720737257">
-    <w:abstractNumId w:val="20"/>
-  </w:num>
-  <w:num w:numId="63" w16cid:durableId="932473284">
-    <w:abstractNumId w:val="14"/>
-  </w:num>
-  <w:num w:numId="64" w16cid:durableId="766118486">
-    <w:abstractNumId w:val="11"/>
-  </w:num>
-  <w:num w:numId="65" w16cid:durableId="840895423">
-    <w:abstractNumId w:val="16"/>
-  </w:num>
-  <w:num w:numId="66" w16cid:durableId="891621001">
-    <w:abstractNumId w:val="10"/>
-  </w:num>
-  <w:num w:numId="67" w16cid:durableId="313918445">
-    <w:abstractNumId w:val="12"/>
-  </w:num>
-  <w:num w:numId="68" w16cid:durableId="544146418">
-    <w:abstractNumId w:val="17"/>
-  </w:num>
-  <w:num w:numId="69" w16cid:durableId="1895267962">
-    <w:abstractNumId w:val="21"/>
+  <w:num w:numId="71" w16cid:durableId="372199308">
+    <w:abstractNumId w:val="29"/>
   </w:num>
   <w:numIdMacAtCleanup w:val="62"/>
 </w:numbering>
 </file>
 
 <file path=word/styles.xml><?xml version="1.0" encoding="utf-8"?>
-<w:styles xmlns:mc="http://schemas.openxmlformats.org/markup-compatibility/2006" xmlns:r="http://schemas.openxmlformats.org/officeDocument/2006/relationships" xmlns:w="http://schemas.openxmlformats.org/wordprocessingml/2006/main" xmlns:w14="http://schemas.microsoft.com/office/word/2010/wordml" xmlns:w15="http://schemas.microsoft.com/office/word/2012/wordml" xmlns:w16cex="http://schemas.microsoft.com/office/word/2018/wordml/cex" xmlns:w16cid="http://schemas.microsoft.com/office/word/2016/wordml/cid" xmlns:w16="http://schemas.microsoft.com/office/word/2018/wordml" xmlns:w16sdtdh="http://schemas.microsoft.com/office/word/2020/wordml/sdtdatahash" xmlns:w16se="http://schemas.microsoft.com/office/word/2015/wordml/symex" mc:Ignorable="w14 w15 w16se w16cid w16 w16cex w16sdtdh">
+<w:styles xmlns:mc="http://schemas.openxmlformats.org/markup-compatibility/2006" xmlns:r="http://schemas.openxmlformats.org/officeDocument/2006/relationships" xmlns:w="http://schemas.openxmlformats.org/wordprocessingml/2006/main" xmlns:w14="http://schemas.microsoft.com/office/word/2010/wordml" xmlns:w15="http://schemas.microsoft.com/office/word/2012/wordml" xmlns:w16cex="http://schemas.microsoft.com/office/word/2018/wordml/cex" xmlns:w16cid="http://schemas.microsoft.com/office/word/2016/wordml/cid" xmlns:w16="http://schemas.microsoft.com/office/word/2018/wordml" xmlns:w16du="http://schemas.microsoft.com/office/word/2023/wordml/word16du" xmlns:w16sdtdh="http://schemas.microsoft.com/office/word/2020/wordml/sdtdatahash" xmlns:w16sdtfl="http://schemas.microsoft.com/office/word/2024/wordml/sdtformatlock" xmlns:w16se="http://schemas.microsoft.com/office/word/2015/wordml/symex" mc:Ignorable="w14 w15 w16se w16cid w16 w16cex w16sdtdh w16sdtfl w16du">
   <w:docDefaults>
     <w:rPrDefault>
       <w:rPr>
@@ -3945,9 +3963,9 @@
   <w:style w:type="paragraph" w:default="1" w:styleId="Normal">
     <w:name w:val="Normal"/>
     <w:qFormat/>
-    <w:rsid w:val="00552DE0"/>
-    <w:pPr>
-      <w:spacing w:before="100" w:beforeAutospacing="1" w:after="100" w:afterAutospacing="1" w:line="240" w:lineRule="auto"/>
+    <w:rsid w:val="00686002"/>
+    <w:pPr>
+      <w:spacing w:after="0" w:line="240" w:lineRule="auto"/>
       <w:jc w:val="both"/>
     </w:pPr>
     <w:rPr>
@@ -4193,9 +4211,6 @@
     <w:semiHidden/>
     <w:unhideWhenUsed/>
     <w:rsid w:val="0039383D"/>
-    <w:pPr>
-      <w:spacing w:after="0"/>
-    </w:pPr>
     <w:rPr>
       <w:rFonts w:ascii="Times New Roman" w:hAnsi="Times New Roman" w:cs="Times New Roman"/>
       <w:sz w:val="18"/>
@@ -4270,7 +4285,7 @@
         <w:ilvl w:val="1"/>
       </w:numPr>
       <w:adjustRightInd w:val="0"/>
-      <w:spacing w:before="240" w:after="0"/>
+      <w:spacing w:before="240"/>
     </w:pPr>
     <w:rPr>
       <w:rFonts w:asciiTheme="majorHAnsi" w:eastAsiaTheme="majorEastAsia" w:hAnsiTheme="majorHAnsi" w:cstheme="majorBidi"/>
@@ -4338,9 +4353,6 @@
     <w:semiHidden/>
     <w:unhideWhenUsed/>
     <w:rsid w:val="0039383D"/>
-    <w:pPr>
-      <w:spacing w:after="0"/>
-    </w:pPr>
     <w:rPr>
       <w:rFonts w:ascii="Times New Roman" w:hAnsi="Times New Roman" w:cs="Times New Roman"/>
       <w:sz w:val="24"/>
@@ -4362,7 +4374,6 @@
         <w:tab w:val="center" w:pos="4536"/>
         <w:tab w:val="right" w:pos="9072"/>
       </w:tabs>
-      <w:spacing w:after="0"/>
       <w:jc w:val="center"/>
     </w:pPr>
     <w:rPr>
@@ -4645,7 +4656,7 @@
     <w:pPr>
       <w:keepNext/>
       <w:keepLines/>
-      <w:spacing w:after="0" w:line="240" w:lineRule="atLeast"/>
+      <w:spacing w:line="240" w:lineRule="atLeast"/>
     </w:pPr>
     <w:rPr>
       <w:rFonts w:asciiTheme="majorHAnsi" w:eastAsia="Times New Roman" w:hAnsiTheme="majorHAnsi" w:cs="Times New Roman"/>
@@ -4663,7 +4674,6 @@
     <w:pPr>
       <w:keepNext/>
       <w:keepLines/>
-      <w:spacing w:after="0"/>
     </w:pPr>
     <w:rPr>
       <w:rFonts w:eastAsia="Times New Roman" w:cs="Times New Roman"/>
@@ -5726,7 +5736,7 @@
     <w:qFormat/>
     <w:rsid w:val="0039383D"/>
     <w:pPr>
-      <w:spacing w:after="0" w:line="240" w:lineRule="atLeast"/>
+      <w:spacing w:line="240" w:lineRule="atLeast"/>
     </w:pPr>
     <w:rPr>
       <w:rFonts w:eastAsia="Times New Roman" w:cs="Times New Roman"/>
@@ -5773,9 +5783,6 @@
     <w:uiPriority w:val="99"/>
     <w:unhideWhenUsed/>
     <w:rsid w:val="0039383D"/>
-    <w:pPr>
-      <w:spacing w:after="0"/>
-    </w:pPr>
     <w:rPr>
       <w:sz w:val="24"/>
       <w:szCs w:val="24"/>
@@ -6486,6 +6493,31 @@
       <w:sz w:val="24"/>
       <w:szCs w:val="24"/>
       <w:lang w:eastAsia="fr-CA"/>
+    </w:rPr>
+  </w:style>
+  <w:style w:type="paragraph" w:customStyle="1" w:styleId="p1">
+    <w:name w:val="p1"/>
+    <w:basedOn w:val="Normal"/>
+    <w:rsid w:val="00686002"/>
+    <w:pPr>
+      <w:jc w:val="left"/>
+    </w:pPr>
+    <w:rPr>
+      <w:rFonts w:ascii="Helvetica" w:eastAsia="Times New Roman" w:hAnsi="Helvetica" w:cs="Times New Roman"/>
+      <w:color w:val="000000"/>
+      <w:sz w:val="17"/>
+      <w:szCs w:val="17"/>
+      <w:lang w:eastAsia="fr-CA"/>
+    </w:rPr>
+  </w:style>
+  <w:style w:type="character" w:customStyle="1" w:styleId="s1">
+    <w:name w:val="s1"/>
+    <w:basedOn w:val="Policepardfaut"/>
+    <w:rsid w:val="00686002"/>
+    <w:rPr>
+      <w:rFonts w:ascii="Arial" w:hAnsi="Arial" w:cs="Arial" w:hint="default"/>
+      <w:sz w:val="17"/>
+      <w:szCs w:val="17"/>
     </w:rPr>
   </w:style>
 </w:styles>
@@ -6690,10 +6722,6 @@
 </file>
 
 <file path=customXml/item1.xml><?xml version="1.0" encoding="utf-8"?>
-<b:Sources xmlns:b="http://schemas.openxmlformats.org/officeDocument/2006/bibliography" xmlns="http://schemas.openxmlformats.org/officeDocument/2006/bibliography" SelectedStyle="/APA.XSL" StyleName="APA"/>
-</file>
-
-<file path=customXml/item2.xml><?xml version="1.0" encoding="utf-8"?>
 <p:properties xmlns:p="http://schemas.microsoft.com/office/2006/metadata/properties" xmlns:xsi="http://www.w3.org/2001/XMLSchema-instance" xmlns:pc="http://schemas.microsoft.com/office/infopath/2007/PartnerControls">
   <documentManagement>
     <TaxCatchAll xmlns="42fb5ebc-0722-48c0-8438-47bcbf4f7e52" xsi:nil="true"/>
@@ -6713,7 +6741,20 @@
 </p:properties>
 </file>
 
+<file path=customXml/item2.xml><?xml version="1.0" encoding="utf-8"?>
+<b:Sources xmlns:b="http://schemas.openxmlformats.org/officeDocument/2006/bibliography" xmlns="http://schemas.openxmlformats.org/officeDocument/2006/bibliography" SelectedStyle="/APA.XSL" StyleName="APA"/>
+</file>
+
 <file path=customXml/item3.xml><?xml version="1.0" encoding="utf-8"?>
+<?mso-contentType ?>
+<FormTemplates xmlns="http://schemas.microsoft.com/sharepoint/v3/contenttype/forms">
+  <Display>DocumentLibraryForm</Display>
+  <Edit>DocumentLibraryForm</Edit>
+  <New>DocumentLibraryForm</New>
+</FormTemplates>
+</file>
+
+<file path=customXml/item4.xml><?xml version="1.0" encoding="utf-8"?>
 <ct:contentTypeSchema xmlns:ct="http://schemas.microsoft.com/office/2006/metadata/contentType" xmlns:ma="http://schemas.microsoft.com/office/2006/metadata/properties/metaAttributes" ct:_="" ma:_="" ma:contentTypeName="Document" ma:contentTypeID="0x0101004CE5182B8F67EB4AACDA43726258D9EE" ma:contentTypeVersion="18" ma:contentTypeDescription="Crée un document." ma:contentTypeScope="" ma:versionID="132f74f701f45ca0c0fbe8c5f7f3d3de">
   <xsd:schema xmlns:xsd="http://www.w3.org/2001/XMLSchema" xmlns:xs="http://www.w3.org/2001/XMLSchema" xmlns:p="http://schemas.microsoft.com/office/2006/metadata/properties" xmlns:ns1="http://schemas.microsoft.com/sharepoint/v3" xmlns:ns2="3462b605-ba9f-445f-a867-9070f06adec7" xmlns:ns3="42fb5ebc-0722-48c0-8438-47bcbf4f7e52" targetNamespace="http://schemas.microsoft.com/office/2006/metadata/properties" ma:root="true" ma:fieldsID="a7725f43faafd08db47dc63ebdb20795" ns1:_="" ns2:_="" ns3:_="">
     <xsd:import namespace="http://schemas.microsoft.com/sharepoint/v3"/>
@@ -6983,24 +7024,7 @@
 </ct:contentTypeSchema>
 </file>
 
-<file path=customXml/item4.xml><?xml version="1.0" encoding="utf-8"?>
-<?mso-contentType ?>
-<FormTemplates xmlns="http://schemas.microsoft.com/sharepoint/v3/contenttype/forms">
-  <Display>DocumentLibraryForm</Display>
-  <Edit>DocumentLibraryForm</Edit>
-  <New>DocumentLibraryForm</New>
-</FormTemplates>
-</file>
-
 <file path=customXml/itemProps1.xml><?xml version="1.0" encoding="utf-8"?>
-<ds:datastoreItem xmlns:ds="http://schemas.openxmlformats.org/officeDocument/2006/customXml" ds:itemID="{5F6AF032-DC5B-EE42-8F8C-817B7258A786}">
-  <ds:schemaRefs>
-    <ds:schemaRef ds:uri="http://schemas.openxmlformats.org/officeDocument/2006/bibliography"/>
-  </ds:schemaRefs>
-</ds:datastoreItem>
-</file>
-
-<file path=customXml/itemProps2.xml><?xml version="1.0" encoding="utf-8"?>
 <ds:datastoreItem xmlns:ds="http://schemas.openxmlformats.org/officeDocument/2006/customXml" ds:itemID="{F351E57F-5773-4769-BA91-0918DC81B0BF}">
   <ds:schemaRefs>
     <ds:schemaRef ds:uri="http://schemas.microsoft.com/office/2006/metadata/properties"/>
@@ -7012,7 +7036,23 @@
 </ds:datastoreItem>
 </file>
 
+<file path=customXml/itemProps2.xml><?xml version="1.0" encoding="utf-8"?>
+<ds:datastoreItem xmlns:ds="http://schemas.openxmlformats.org/officeDocument/2006/customXml" ds:itemID="{5F6AF032-DC5B-EE42-8F8C-817B7258A786}">
+  <ds:schemaRefs>
+    <ds:schemaRef ds:uri="http://schemas.openxmlformats.org/officeDocument/2006/bibliography"/>
+  </ds:schemaRefs>
+</ds:datastoreItem>
+</file>
+
 <file path=customXml/itemProps3.xml><?xml version="1.0" encoding="utf-8"?>
+<ds:datastoreItem xmlns:ds="http://schemas.openxmlformats.org/officeDocument/2006/customXml" ds:itemID="{939DA83A-8AD7-4297-8B24-ADCCD7F21632}">
+  <ds:schemaRefs>
+    <ds:schemaRef ds:uri="http://schemas.microsoft.com/sharepoint/v3/contenttype/forms"/>
+  </ds:schemaRefs>
+</ds:datastoreItem>
+</file>
+
+<file path=customXml/itemProps4.xml><?xml version="1.0" encoding="utf-8"?>
 <ds:datastoreItem xmlns:ds="http://schemas.openxmlformats.org/officeDocument/2006/customXml" ds:itemID="{D993E9CA-FD0E-40F0-ABC9-23D0A2C2B39D}">
   <ds:schemaRefs>
     <ds:schemaRef ds:uri="http://schemas.microsoft.com/office/2006/metadata/contentType"/>
@@ -7030,12 +7070,4 @@
     <ds:schemaRef ds:uri="http://schemas.microsoft.com/internal/obd"/>
   </ds:schemaRefs>
 </ds:datastoreItem>
-</file>
-
-<file path=customXml/itemProps4.xml><?xml version="1.0" encoding="utf-8"?>
-<ds:datastoreItem xmlns:ds="http://schemas.openxmlformats.org/officeDocument/2006/customXml" ds:itemID="{939DA83A-8AD7-4297-8B24-ADCCD7F21632}">
-  <ds:schemaRefs>
-    <ds:schemaRef ds:uri="http://schemas.microsoft.com/sharepoint/v3/contenttype/forms"/>
-  </ds:schemaRefs>
-</ds:datastoreItem>
 </file>
</xml_diff>